<commit_message>
Add upstream MCP directory and evidence boundaries
🤖 Generated with Codex
</commit_message>
<xml_diff>
--- a/artifacts/SECUREMCP_BUSINESS_BRIEF.docx
+++ b/artifacts/SECUREMCP_BUSINESS_BRIEF.docx
@@ -50,7 +50,7 @@
           <w:sz w:val="20"/>
           <w:szCs w:val="20"/>
         </w:rPr>
-        <w:t xml:space="preserve">Written for product, sales, and marketing. No engineering background assumed.</w:t>
+        <w:t xml:space="preserve">Control, proof, and trust for AI agents that take action on business systems.</w:t>
       </w:r>
     </w:p>
     <w:p>
@@ -108,25 +108,25 @@
           <w:sz w:val="28"/>
           <w:szCs w:val="28"/>
         </w:rPr>
-        <w:t xml:space="preserve">1. In One Page</w:t>
-      </w:r>
-    </w:p>
-    <w:p>
-      <w:pPr>
-        <w:spacing w:after="150" w:line="276"/>
-      </w:pPr>
-      <w:r>
-        <w:rPr>
-          <w:rFonts w:ascii="Georgia" w:cs="Georgia" w:eastAsia="Georgia" w:hAnsi="Georgia"/>
-          <w:b w:val="false"/>
-          <w:bCs w:val="false"/>
-          <w:i w:val="false"/>
-          <w:iCs w:val="false"/>
-          <w:color w:val="1C1E21"/>
-          <w:sz w:val="21"/>
-          <w:szCs w:val="21"/>
-        </w:rPr>
-        <w:t xml:space="preserve">AI assistants used to answer questions. Now they take actions — query a customer database, issue a refund, send an email, update a record, call an internal service. The industry standard that makes this possible is the Model Context Protocol (MCP). It has been adopted quickly because it works.</w:t>
+        <w:t xml:space="preserve">1. Executive Summary</w:t>
+      </w:r>
+    </w:p>
+    <w:p>
+      <w:pPr>
+        <w:spacing w:after="150" w:line="276"/>
+      </w:pPr>
+      <w:r>
+        <w:rPr>
+          <w:rFonts w:ascii="Georgia" w:cs="Georgia" w:eastAsia="Georgia" w:hAnsi="Georgia"/>
+          <w:b w:val="false"/>
+          <w:bCs w:val="false"/>
+          <w:i w:val="false"/>
+          <w:iCs w:val="false"/>
+          <w:color w:val="1C1E21"/>
+          <w:sz w:val="21"/>
+          <w:szCs w:val="21"/>
+        </w:rPr>
+        <w:t xml:space="preserve">AI assistants used to answer questions. Now they take actions — query a customer database, issue a refund, send an email, update a record, call an internal service. The industry standard that makes this possible is the Model Context Protocol (MCP), and it has been adopted quickly because it works.</w:t>
       </w:r>
     </w:p>
     <w:p>
@@ -188,7 +188,7 @@
           <w:sz w:val="21"/>
           <w:szCs w:val="21"/>
         </w:rPr>
-        <w:t xml:space="preserve">SecureMCP is the layer that adds those answers. The framing that fits on a slide:</w:t>
+        <w:t xml:space="preserve">SecureMCP is the layer that adds those answers.</w:t>
       </w:r>
     </w:p>
     <w:p>
@@ -742,7 +742,7 @@
           <w:sz w:val="21"/>
           <w:szCs w:val="21"/>
         </w:rPr>
-        <w:t xml:space="preserve">It is built as fourteen independent capabilities. Each one is switched on separately, so a customer can start with a single capability and expand, rather than committing to an all-or-nothing platform decision. That matters commercially: the first deployment can be small.</w:t>
+        <w:t xml:space="preserve">It is built as fourteen independent capabilities, each switched on separately. An organisation can start with one capability and expand, rather than committing to an all-or-nothing platform decision. The first deployment can be small.</w:t>
       </w:r>
     </w:p>
     <w:p>
@@ -775,7 +775,7 @@
           <w:sz w:val="28"/>
           <w:szCs w:val="28"/>
         </w:rPr>
-        <w:t xml:space="preserve">2. The Problem: Agents That Act</w:t>
+        <w:t xml:space="preserve">2. Why This Matters Now</w:t>
       </w:r>
     </w:p>
     <w:p>
@@ -904,7 +904,7 @@
           <w:sz w:val="21"/>
           <w:szCs w:val="21"/>
         </w:rPr>
-        <w:t xml:space="preserve">The specific risks this creates are ones any risk committee will recognise:</w:t>
+        <w:t xml:space="preserve">The exposures this creates are ones any risk committee will recognise:</w:t>
       </w:r>
     </w:p>
     <w:p>
@@ -973,7 +973,7 @@
           <w:sz w:val="21"/>
           <w:szCs w:val="21"/>
         </w:rPr>
-        <w:t xml:space="preserve">A permission granted for one narrow purpose is reused far more broadly</w:t>
+        <w:t xml:space="preserve">A permission granted for one narrow purpose is quietly reused far more broadly</w:t>
       </w:r>
     </w:p>
     <w:p>
@@ -1106,25 +1106,25 @@
           <w:sz w:val="21"/>
           <w:szCs w:val="21"/>
         </w:rPr>
-        <w:t xml:space="preserve">An MCP server is a building full of rooms — each room a system the agent can use. Before SecureMCP, the agent walks in and opens any door it can find. After SecureMCP, there is a desk at the entrance, a badge with specific room access, a visitor log that cannot be quietly edited, and a guard who notices when someone who normally visits two rooms suddenly tries forty.</w:t>
-      </w:r>
-    </w:p>
-    <w:p>
-      <w:pPr>
-        <w:spacing w:after="150" w:line="276"/>
-      </w:pPr>
-      <w:r>
-        <w:rPr>
-          <w:rFonts w:ascii="Georgia" w:cs="Georgia" w:eastAsia="Georgia" w:hAnsi="Georgia"/>
-          <w:b w:val="false"/>
-          <w:bCs w:val="false"/>
-          <w:i w:val="false"/>
-          <w:iCs w:val="false"/>
-          <w:color w:val="1C1E21"/>
-          <w:sz w:val="21"/>
-          <w:szCs w:val="21"/>
-        </w:rPr>
-        <w:t xml:space="preserve">Three properties are worth understanding, because they come up in nearly every customer conversation.</w:t>
+        <w:t xml:space="preserve">An MCP server is a building full of rooms, each room a system the agent can use. Before SecureMCP, the agent walks in and opens any door it can find. After SecureMCP, there is a desk at the entrance, a badge with specific room access, a visitor log that cannot be quietly edited, and a guard who notices when someone who normally visits two rooms suddenly tries forty.</w:t>
+      </w:r>
+    </w:p>
+    <w:p>
+      <w:pPr>
+        <w:spacing w:after="150" w:line="276"/>
+      </w:pPr>
+      <w:r>
+        <w:rPr>
+          <w:rFonts w:ascii="Georgia" w:cs="Georgia" w:eastAsia="Georgia" w:hAnsi="Georgia"/>
+          <w:b w:val="false"/>
+          <w:bCs w:val="false"/>
+          <w:i w:val="false"/>
+          <w:iCs w:val="false"/>
+          <w:color w:val="1C1E21"/>
+          <w:sz w:val="21"/>
+          <w:szCs w:val="21"/>
+        </w:rPr>
+        <w:t xml:space="preserve">Three properties define how it behaves.</w:t>
       </w:r>
     </w:p>
     <w:p>
@@ -1155,7 +1155,7 @@
           <w:sz w:val="21"/>
           <w:szCs w:val="21"/>
         </w:rPr>
-        <w:t xml:space="preserve"> SecureMCP attaches to an existing MCP server rather than replacing it. Nothing has to be rebuilt, and the server keeps working the way it did. This is the difference between a governance project that takes two weeks and one that takes two quarters.</w:t>
+        <w:t xml:space="preserve"> SecureMCP attaches to an existing MCP server rather than replacing it. Nothing has to be rebuilt, and the server keeps working the way it did. This is the difference between a governance initiative measured in weeks and one measured in quarters.</w:t>
       </w:r>
     </w:p>
     <w:p>
@@ -1186,7 +1186,7 @@
           <w:sz w:val="21"/>
           <w:szCs w:val="21"/>
         </w:rPr>
-        <w:t xml:space="preserve"> There is no "security mode" that either is or is not on. Fourteen capabilities are switched on individually. A customer worried about audit turns on the record-keeping. A customer worried about regulated data turns on the rule engine. Neither is forced to take the other.</w:t>
+        <w:t xml:space="preserve"> There is no single security mode that either is or is not on. Fourteen capabilities are switched on individually. An organisation concerned with audit turns on record-keeping. One concerned with regulated data turns on the rule engine. Neither requires the other.</w:t>
       </w:r>
     </w:p>
     <w:p>
@@ -1217,7 +1217,7 @@
           <w:sz w:val="21"/>
           <w:szCs w:val="21"/>
         </w:rPr>
-        <w:t xml:space="preserve"> If the rule engine cannot reach a clear answer — a rule component failed, the request cannot be described properly — the default outcome is to deny the action. This is the correct default for a governance product, and it is worth stating explicitly to buyers, because the alternative failure mode is the one that produces incidents: a system that quietly allows everything the moment something breaks.</w:t>
+        <w:t xml:space="preserve"> If the rule engine cannot reach a clear answer — a rule component failed, or the request cannot be described properly — the default outcome is to deny the action. This is the correct default for a governance system. The alternative failure mode is the one that produces incidents: a system that quietly allows everything the moment something breaks.</w:t>
       </w:r>
     </w:p>
     <w:p>
@@ -1250,25 +1250,25 @@
           <w:sz w:val="28"/>
           <w:szCs w:val="28"/>
         </w:rPr>
-        <w:t xml:space="preserve">4. The Five Checkpoints</w:t>
-      </w:r>
-    </w:p>
-    <w:p>
-      <w:pPr>
-        <w:spacing w:after="150" w:line="276"/>
-      </w:pPr>
-      <w:r>
-        <w:rPr>
-          <w:rFonts w:ascii="Georgia" w:cs="Georgia" w:eastAsia="Georgia" w:hAnsi="Georgia"/>
-          <w:b w:val="false"/>
-          <w:bCs w:val="false"/>
-          <w:i w:val="false"/>
-          <w:iCs w:val="false"/>
-          <w:color w:val="1C1E21"/>
-          <w:sz w:val="21"/>
-          <w:szCs w:val="21"/>
-        </w:rPr>
-        <w:t xml:space="preserve">Every request an agent makes passes through five checkpoints in a fixed order before it reaches the system it is trying to use. The order is not arbitrary — each checkpoint is placed where it can do its job most cheaply and most reliably.</w:t>
+        <w:t xml:space="preserve">4. How a Request Is Governed</w:t>
+      </w:r>
+    </w:p>
+    <w:p>
+      <w:pPr>
+        <w:spacing w:after="150" w:line="276"/>
+      </w:pPr>
+      <w:r>
+        <w:rPr>
+          <w:rFonts w:ascii="Georgia" w:cs="Georgia" w:eastAsia="Georgia" w:hAnsi="Georgia"/>
+          <w:b w:val="false"/>
+          <w:bCs w:val="false"/>
+          <w:i w:val="false"/>
+          <w:iCs w:val="false"/>
+          <w:color w:val="1C1E21"/>
+          <w:sz w:val="21"/>
+          <w:szCs w:val="21"/>
+        </w:rPr>
+        <w:t xml:space="preserve">Every request an agent makes passes through five checkpoints in a fixed order before it reaches the system it is trying to use. The order is deliberate — each checkpoint sits where it can do its job most cheaply and most reliably.</w:t>
       </w:r>
     </w:p>
     <w:p>
@@ -1344,7 +1344,7 @@
           <w:sz w:val="15"/>
           <w:szCs w:val="15"/>
         </w:rPr>
-        <w:t xml:space="preserve">   1. Is this allowed?          ── the rule engine</w:t>
+        <w:t xml:space="preserve">   1. Is this allowed?           ── the rule engine</w:t>
       </w:r>
     </w:p>
     <w:p>
@@ -1458,7 +1458,7 @@
           <w:sz w:val="15"/>
           <w:szCs w:val="15"/>
         </w:rPr>
-        <w:t xml:space="preserve">   3. Write it down             ── the record</w:t>
+        <w:t xml:space="preserve">   3. Write it down              ── the record</w:t>
       </w:r>
     </w:p>
     <w:p>
@@ -1515,7 +1515,7 @@
           <w:sz w:val="15"/>
           <w:szCs w:val="15"/>
         </w:rPr>
-        <w:t xml:space="preserve">   4. Does this look normal?    ── the behaviour watch</w:t>
+        <w:t xml:space="preserve">   4. Does this look normal?     ── the behaviour watch</w:t>
       </w:r>
     </w:p>
     <w:p>
@@ -1572,7 +1572,7 @@
           <w:sz w:val="15"/>
           <w:szCs w:val="15"/>
         </w:rPr>
-        <w:t xml:space="preserve">   5. Did the owner consent?    ── the permission check</w:t>
+        <w:t xml:space="preserve">   5. Did the owner consent?     ── the permission check</w:t>
       </w:r>
     </w:p>
     <w:p>
@@ -1647,38 +1647,38 @@
           <w:sz w:val="21"/>
           <w:szCs w:val="21"/>
         </w:rPr>
-        <w:t xml:space="preserve">1. Is this allowed?</w:t>
-      </w:r>
-      <w:r>
-        <w:rPr>
-          <w:rFonts w:ascii="Georgia" w:cs="Georgia" w:eastAsia="Georgia" w:hAnsi="Georgia"/>
-          <w:b w:val="false"/>
-          <w:bCs w:val="false"/>
-          <w:i w:val="false"/>
-          <w:iCs w:val="false"/>
-          <w:color w:val="1C1E21"/>
-          <w:sz w:val="21"/>
-          <w:szCs w:val="21"/>
-        </w:rPr>
-        <w:t xml:space="preserve"> The rule engine evaluates the request against the organisation's policies. This runs first because a clear "no" should cost as little as possible.</w:t>
-      </w:r>
-    </w:p>
-    <w:p>
-      <w:pPr>
-        <w:spacing w:after="150" w:line="276"/>
-      </w:pPr>
-      <w:r>
-        <w:rPr>
-          <w:rFonts w:ascii="Georgia" w:cs="Georgia" w:eastAsia="Georgia" w:hAnsi="Georgia"/>
-          <w:b w:val="false"/>
-          <w:bCs w:val="false"/>
-          <w:i w:val="false"/>
-          <w:iCs w:val="false"/>
-          <w:color w:val="1C1E21"/>
-          <w:sz w:val="21"/>
-          <w:szCs w:val="21"/>
-        </w:rPr>
-        <w:t xml:space="preserve">There is a detail here worth carrying into sales conversations. When an agent asks "what can I do?", SecureMCP filters the answer to only what that requester is actually permitted to use. Tools the agent cannot use do not appear in the list at all. Capability the requester is not entitled to is not merely blocked — it is invisible. Buyers consistently find this more reassuring than a block, because it removes the temptation to probe.</w:t>
+        <w:t xml:space="preserve">Is this allowed?</w:t>
+      </w:r>
+      <w:r>
+        <w:rPr>
+          <w:rFonts w:ascii="Georgia" w:cs="Georgia" w:eastAsia="Georgia" w:hAnsi="Georgia"/>
+          <w:b w:val="false"/>
+          <w:bCs w:val="false"/>
+          <w:i w:val="false"/>
+          <w:iCs w:val="false"/>
+          <w:color w:val="1C1E21"/>
+          <w:sz w:val="21"/>
+          <w:szCs w:val="21"/>
+        </w:rPr>
+        <w:t xml:space="preserve"> The rule engine evaluates the request against the organisation's policies. It runs first because a clear denial should cost as little as possible.</w:t>
+      </w:r>
+    </w:p>
+    <w:p>
+      <w:pPr>
+        <w:spacing w:after="150" w:line="276"/>
+      </w:pPr>
+      <w:r>
+        <w:rPr>
+          <w:rFonts w:ascii="Georgia" w:cs="Georgia" w:eastAsia="Georgia" w:hAnsi="Georgia"/>
+          <w:b w:val="false"/>
+          <w:bCs w:val="false"/>
+          <w:i w:val="false"/>
+          <w:iCs w:val="false"/>
+          <w:color w:val="1C1E21"/>
+          <w:sz w:val="21"/>
+          <w:szCs w:val="21"/>
+        </w:rPr>
+        <w:t xml:space="preserve">One consequence is worth drawing out. When an agent asks what it is able to do, SecureMCP filters the answer to only what that requester is actually permitted to use. Tools the agent cannot use do not appear in the list at all. Capability the requester is not entitled to is not merely blocked — it is invisible, which removes the opportunity to probe for it.</w:t>
       </w:r>
     </w:p>
     <w:p>
@@ -1696,20 +1696,20 @@
           <w:sz w:val="21"/>
           <w:szCs w:val="21"/>
         </w:rPr>
-        <w:t xml:space="preserve">2. Is it within agreed terms?</w:t>
-      </w:r>
-      <w:r>
-        <w:rPr>
-          <w:rFonts w:ascii="Georgia" w:cs="Georgia" w:eastAsia="Georgia" w:hAnsi="Georgia"/>
-          <w:b w:val="false"/>
-          <w:bCs w:val="false"/>
-          <w:i w:val="false"/>
-          <w:iCs w:val="false"/>
-          <w:color w:val="1C1E21"/>
-          <w:sz w:val="21"/>
-          <w:szCs w:val="21"/>
-        </w:rPr>
-        <w:t xml:space="preserve"> Where an agent has negotiated a working agreement — what it may do, which resources it may touch, for how long — that agreement is checked. Both sides can be required to sign it cryptographically, which means neither can later claim they agreed to something different.</w:t>
+        <w:t xml:space="preserve">Is it within agreed terms?</w:t>
+      </w:r>
+      <w:r>
+        <w:rPr>
+          <w:rFonts w:ascii="Georgia" w:cs="Georgia" w:eastAsia="Georgia" w:hAnsi="Georgia"/>
+          <w:b w:val="false"/>
+          <w:bCs w:val="false"/>
+          <w:i w:val="false"/>
+          <w:iCs w:val="false"/>
+          <w:color w:val="1C1E21"/>
+          <w:sz w:val="21"/>
+          <w:szCs w:val="21"/>
+        </w:rPr>
+        <w:t xml:space="preserve"> Where an agent has negotiated a working agreement — what it may do, which resources it may touch, for how long — that agreement is checked. Both sides can be required to sign it cryptographically, so neither can later claim they agreed to something different.</w:t>
       </w:r>
     </w:p>
     <w:p>
@@ -1727,20 +1727,20 @@
           <w:sz w:val="21"/>
           <w:szCs w:val="21"/>
         </w:rPr>
-        <w:t xml:space="preserve">3. Write it down.</w:t>
-      </w:r>
-      <w:r>
-        <w:rPr>
-          <w:rFonts w:ascii="Georgia" w:cs="Georgia" w:eastAsia="Georgia" w:hAnsi="Georgia"/>
-          <w:b w:val="false"/>
-          <w:bCs w:val="false"/>
-          <w:i w:val="false"/>
-          <w:iCs w:val="false"/>
-          <w:color w:val="1C1E21"/>
-          <w:sz w:val="21"/>
-          <w:szCs w:val="21"/>
-        </w:rPr>
-        <w:t xml:space="preserve"> The action is recorded. Successes and failures both, because a blocked attempt is often the more interesting entry. This is covered in section 6.</w:t>
+        <w:t xml:space="preserve">Write it down.</w:t>
+      </w:r>
+      <w:r>
+        <w:rPr>
+          <w:rFonts w:ascii="Georgia" w:cs="Georgia" w:eastAsia="Georgia" w:hAnsi="Georgia"/>
+          <w:b w:val="false"/>
+          <w:bCs w:val="false"/>
+          <w:i w:val="false"/>
+          <w:iCs w:val="false"/>
+          <w:color w:val="1C1E21"/>
+          <w:sz w:val="21"/>
+          <w:szCs w:val="21"/>
+        </w:rPr>
+        <w:t xml:space="preserve"> The action is recorded, successes and failures alike, because a blocked attempt is often the more significant entry. Section 6 covers what this record makes possible.</w:t>
       </w:r>
     </w:p>
     <w:p>
@@ -1758,38 +1758,38 @@
           <w:sz w:val="21"/>
           <w:szCs w:val="21"/>
         </w:rPr>
-        <w:t xml:space="preserve">4. Does this look normal?</w:t>
-      </w:r>
-      <w:r>
-        <w:rPr>
-          <w:rFonts w:ascii="Georgia" w:cs="Georgia" w:eastAsia="Georgia" w:hAnsi="Georgia"/>
-          <w:b w:val="false"/>
-          <w:bCs w:val="false"/>
-          <w:i w:val="false"/>
-          <w:iCs w:val="false"/>
-          <w:color w:val="1C1E21"/>
-          <w:sz w:val="21"/>
-          <w:szCs w:val="21"/>
-        </w:rPr>
-        <w:t xml:space="preserve"> SecureMCP builds a picture of each requester's normal behaviour — how often it calls, how fast, how often it errors — and measures each new request against that picture. The mechanism is the same idea as credit card fraud detection: the individual purchase is not suspicious, the pattern is.</w:t>
-      </w:r>
-    </w:p>
-    <w:p>
-      <w:pPr>
-        <w:spacing w:after="150" w:line="276"/>
-      </w:pPr>
-      <w:r>
-        <w:rPr>
-          <w:rFonts w:ascii="Georgia" w:cs="Georgia" w:eastAsia="Georgia" w:hAnsi="Georgia"/>
-          <w:b w:val="false"/>
-          <w:bCs w:val="false"/>
-          <w:i w:val="false"/>
-          <w:iCs w:val="false"/>
-          <w:color w:val="1C1E21"/>
-          <w:sz w:val="21"/>
-          <w:szCs w:val="21"/>
-        </w:rPr>
-        <w:t xml:space="preserve">Responses escalate rather than jumping straight to a block: continue, ask a human to confirm, slow the requester down, or stop it entirely.</w:t>
+        <w:t xml:space="preserve">Does this look normal?</w:t>
+      </w:r>
+      <w:r>
+        <w:rPr>
+          <w:rFonts w:ascii="Georgia" w:cs="Georgia" w:eastAsia="Georgia" w:hAnsi="Georgia"/>
+          <w:b w:val="false"/>
+          <w:bCs w:val="false"/>
+          <w:i w:val="false"/>
+          <w:iCs w:val="false"/>
+          <w:color w:val="1C1E21"/>
+          <w:sz w:val="21"/>
+          <w:szCs w:val="21"/>
+        </w:rPr>
+        <w:t xml:space="preserve"> SecureMCP builds a picture of each requester's normal behaviour — how often it calls, how fast, how often it errors — and measures each new request against that picture. The principle is the same as credit card fraud detection: the individual transaction is not suspicious, the pattern is.</w:t>
+      </w:r>
+    </w:p>
+    <w:p>
+      <w:pPr>
+        <w:spacing w:after="150" w:line="276"/>
+      </w:pPr>
+      <w:r>
+        <w:rPr>
+          <w:rFonts w:ascii="Georgia" w:cs="Georgia" w:eastAsia="Georgia" w:hAnsi="Georgia"/>
+          <w:b w:val="false"/>
+          <w:bCs w:val="false"/>
+          <w:i w:val="false"/>
+          <w:iCs w:val="false"/>
+          <w:color w:val="1C1E21"/>
+          <w:sz w:val="21"/>
+          <w:szCs w:val="21"/>
+        </w:rPr>
+        <w:t xml:space="preserve">Responses escalate rather than jumping straight to a block: continue, ask a person to confirm, slow the requester down, or stop it entirely.</w:t>
       </w:r>
     </w:p>
     <w:p>
@@ -1807,20 +1807,20 @@
           <w:sz w:val="21"/>
           <w:szCs w:val="21"/>
         </w:rPr>
-        <w:t xml:space="preserve">5. Did the owner consent?</w:t>
-      </w:r>
-      <w:r>
-        <w:rPr>
-          <w:rFonts w:ascii="Georgia" w:cs="Georgia" w:eastAsia="Georgia" w:hAnsi="Georgia"/>
-          <w:b w:val="false"/>
-          <w:bCs w:val="false"/>
-          <w:i w:val="false"/>
-          <w:iCs w:val="false"/>
-          <w:color w:val="1C1E21"/>
-          <w:sz w:val="21"/>
-          <w:szCs w:val="21"/>
-        </w:rPr>
-        <w:t xml:space="preserve"> The last check before the action happens is whether the owner of the data or resource actually permitted this requester to do this thing.</w:t>
+        <w:t xml:space="preserve">Did the owner consent?</w:t>
+      </w:r>
+      <w:r>
+        <w:rPr>
+          <w:rFonts w:ascii="Georgia" w:cs="Georgia" w:eastAsia="Georgia" w:hAnsi="Georgia"/>
+          <w:b w:val="false"/>
+          <w:bCs w:val="false"/>
+          <w:i w:val="false"/>
+          <w:iCs w:val="false"/>
+          <w:color w:val="1C1E21"/>
+          <w:sz w:val="21"/>
+          <w:szCs w:val="21"/>
+        </w:rPr>
+        <w:t xml:space="preserve"> The final check before the action happens is whether the owner of the data or resource actually permitted this requester to do this thing.</w:t>
       </w:r>
     </w:p>
     <w:p>
@@ -1871,7 +1871,7 @@
           <w:sz w:val="21"/>
           <w:szCs w:val="21"/>
         </w:rPr>
-        <w:t xml:space="preserve">Each of these is enabled independently. The right-hand column is the version to use with a non-technical buyer.</w:t>
+        <w:t xml:space="preserve">Each of these is enabled independently.</w:t>
       </w:r>
     </w:p>
     <w:tbl>
@@ -1952,7 +1952,7 @@
                 <w:sz w:val="17"/>
                 <w:szCs w:val="17"/>
               </w:rPr>
-              <w:t xml:space="preserve">What it does, in business terms</w:t>
+              <w:t xml:space="preserve">What it does</w:t>
             </w:r>
           </w:p>
         </w:tc>
@@ -2330,7 +2330,7 @@
                 <w:sz w:val="18"/>
                 <w:szCs w:val="18"/>
               </w:rPr>
-              <w:t xml:space="preserve">Emits security events so existing monitoring tools can consume them</w:t>
+              <w:t xml:space="preserve">Emits security events for existing monitoring tools to consume</w:t>
             </w:r>
           </w:p>
         </w:tc>
@@ -2860,7 +2860,7 @@
           <w:sz w:val="21"/>
           <w:szCs w:val="21"/>
         </w:rPr>
-        <w:t xml:space="preserve">Only the first five sit on the path of every request. The rest run at publish time, at query time, or on demand — which is the answer to the performance question when it comes up.</w:t>
+        <w:t xml:space="preserve">Only the first five sit on the path of every request. The rest run when a tool is published, when a question is asked, or on demand.</w:t>
       </w:r>
     </w:p>
     <w:p>
@@ -2893,25 +2893,7 @@
           <w:sz w:val="28"/>
           <w:szCs w:val="28"/>
         </w:rPr>
-        <w:t xml:space="preserve">6. Proof: The Part Auditors Care About</w:t>
-      </w:r>
-    </w:p>
-    <w:p>
-      <w:pPr>
-        <w:spacing w:after="150" w:line="276"/>
-      </w:pPr>
-      <w:r>
-        <w:rPr>
-          <w:rFonts w:ascii="Georgia" w:cs="Georgia" w:eastAsia="Georgia" w:hAnsi="Georgia"/>
-          <w:b w:val="false"/>
-          <w:bCs w:val="false"/>
-          <w:i w:val="false"/>
-          <w:iCs w:val="false"/>
-          <w:color w:val="1C1E21"/>
-          <w:sz w:val="21"/>
-          <w:szCs w:val="21"/>
-        </w:rPr>
-        <w:t xml:space="preserve">The record-keeping deserves its own section, because it is the capability that most often turns a technical evaluation into a signed contract.</w:t>
+        <w:t xml:space="preserve">6. Proof and Audit</w:t>
       </w:r>
     </w:p>
     <w:p>
@@ -3009,7 +2991,7 @@
           <w:sz w:val="21"/>
           <w:szCs w:val="21"/>
         </w:rPr>
-        <w:t xml:space="preserve"> A specific action can be proven to belong to the record without handing over the rest of it. This matters in practice: a dispute about one transaction does not require disclosing every other transaction to resolve it.</w:t>
+        <w:t xml:space="preserve"> A specific action can be proven to belong to the record without handing over the rest of it. A dispute about one transaction does not require disclosing every other transaction to resolve it.</w:t>
       </w:r>
     </w:p>
     <w:p>
@@ -3040,56 +3022,43 @@
           <w:sz w:val="21"/>
           <w:szCs w:val="21"/>
         </w:rPr>
-        <w:t xml:space="preserve"> SecureMCP can export a self-contained evidence package for any entry. An auditor, a regulator, or the other side of a dispute can verify it independently, on their own machine, with no access to the running system. Integrity is something they confirm, not something the vendor asserts.</w:t>
-      </w:r>
-    </w:p>
-    <w:p>
-      <w:pPr>
-        <w:spacing w:after="150" w:line="276"/>
-      </w:pPr>
-      <w:r>
-        <w:rPr>
-          <w:rFonts w:ascii="Georgia" w:cs="Georgia" w:eastAsia="Georgia" w:hAnsi="Georgia"/>
-          <w:b w:val="false"/>
-          <w:bCs w:val="false"/>
-          <w:i w:val="false"/>
-          <w:iCs w:val="false"/>
-          <w:color w:val="1C1E21"/>
-          <w:sz w:val="21"/>
-          <w:szCs w:val="21"/>
-        </w:rPr>
-        <w:t xml:space="preserve">Two related points for accuracy. The record captures what was asked and what the outcome was, not a copy of the data that came back — deliberately, so that sensitive results are not duplicated into a permanent store. And each record entry is anchored to a random starting value unique to that record, so a plausible-looking fake record cannot be manufactured and passed off as the real one.</w:t>
-      </w:r>
-    </w:p>
-    <w:p>
-      <w:pPr>
-        <w:spacing w:after="150" w:line="276"/>
-      </w:pPr>
-      <w:r>
-        <w:rPr>
-          <w:rFonts w:ascii="Georgia" w:cs="Georgia" w:eastAsia="Georgia" w:hAnsi="Georgia"/>
-          <w:b/>
-          <w:bCs/>
-          <w:i w:val="false"/>
-          <w:iCs w:val="false"/>
-          <w:color w:val="1C1E21"/>
-          <w:sz w:val="21"/>
-          <w:szCs w:val="21"/>
-        </w:rPr>
-        <w:t xml:space="preserve">How to use this in a conversation.</w:t>
-      </w:r>
-      <w:r>
-        <w:rPr>
-          <w:rFonts w:ascii="Georgia" w:cs="Georgia" w:eastAsia="Georgia" w:hAnsi="Georgia"/>
-          <w:b w:val="false"/>
-          <w:bCs w:val="false"/>
-          <w:i w:val="false"/>
-          <w:iCs w:val="false"/>
-          <w:color w:val="1C1E21"/>
-          <w:sz w:val="21"/>
-          <w:szCs w:val="21"/>
-        </w:rPr>
-        <w:t xml:space="preserve"> The question "how would you prove to a regulator what your AI agent did last March?" is a strong one, because most organisations cannot answer it. This is the answer.</w:t>
+        <w:t xml:space="preserve"> SecureMCP can export a self-contained evidence package for any entry. An auditor, a regulator, or the other side of a dispute can verify it independently, on their own machine, with no access to the running system. Integrity is confirmed by the party who needs the assurance, not asserted by the organisation being examined.</w:t>
+      </w:r>
+    </w:p>
+    <w:p>
+      <w:pPr>
+        <w:spacing w:after="150" w:line="276"/>
+      </w:pPr>
+      <w:r>
+        <w:rPr>
+          <w:rFonts w:ascii="Georgia" w:cs="Georgia" w:eastAsia="Georgia" w:hAnsi="Georgia"/>
+          <w:b w:val="false"/>
+          <w:bCs w:val="false"/>
+          <w:i w:val="false"/>
+          <w:iCs w:val="false"/>
+          <w:color w:val="1C1E21"/>
+          <w:sz w:val="21"/>
+          <w:szCs w:val="21"/>
+        </w:rPr>
+        <w:t xml:space="preserve">Two points of accuracy. The record captures what was asked and what the outcome was, not a copy of the data that came back — deliberately, so that sensitive results are not duplicated into a permanent store. And each record is anchored to a random starting value unique to it, so a plausible-looking fabricated record cannot be manufactured and passed off as the real one.</w:t>
+      </w:r>
+    </w:p>
+    <w:p>
+      <w:pPr>
+        <w:spacing w:after="150" w:line="276"/>
+      </w:pPr>
+      <w:r>
+        <w:rPr>
+          <w:rFonts w:ascii="Georgia" w:cs="Georgia" w:eastAsia="Georgia" w:hAnsi="Georgia"/>
+          <w:b w:val="false"/>
+          <w:bCs w:val="false"/>
+          <w:i w:val="false"/>
+          <w:iCs w:val="false"/>
+          <w:color w:val="1C1E21"/>
+          <w:sz w:val="21"/>
+          <w:szCs w:val="21"/>
+        </w:rPr>
+        <w:t xml:space="preserve">The practical test is a question most organisations currently cannot answer: how would the actions taken by an AI agent last March be proven to a regulator today? This is the answer.</w:t>
       </w:r>
     </w:p>
     <w:p>
@@ -3140,24 +3109,6 @@
           <w:sz w:val="21"/>
           <w:szCs w:val="21"/>
         </w:rPr>
-        <w:t xml:space="preserve">Permission handling contains one design decision worth understanding, because it addresses a risk that is easy to describe and hard to solve.</w:t>
-      </w:r>
-    </w:p>
-    <w:p>
-      <w:pPr>
-        <w:spacing w:after="150" w:line="276"/>
-      </w:pPr>
-      <w:r>
-        <w:rPr>
-          <w:rFonts w:ascii="Georgia" w:cs="Georgia" w:eastAsia="Georgia" w:hAnsi="Georgia"/>
-          <w:b w:val="false"/>
-          <w:bCs w:val="false"/>
-          <w:i w:val="false"/>
-          <w:iCs w:val="false"/>
-          <w:color w:val="1C1E21"/>
-          <w:sz w:val="21"/>
-          <w:szCs w:val="21"/>
-        </w:rPr>
         <w:t xml:space="preserve">Permissions in SecureMCP are specific: this requester may do this particular thing with this particular resource, optionally only under certain conditions, and optionally only until a certain date.</w:t>
       </w:r>
     </w:p>
@@ -3220,43 +3171,43 @@
           <w:sz w:val="21"/>
           <w:szCs w:val="21"/>
         </w:rPr>
-        <w:t xml:space="preserve">Withdrawal follows the same logic. Revoking a permission automatically revokes everything derived from it. There is no orphaned access still working because it was handed off before the withdrawal.</w:t>
-      </w:r>
-    </w:p>
-    <w:p>
-      <w:pPr>
-        <w:spacing w:after="150" w:line="276"/>
-      </w:pPr>
-      <w:r>
-        <w:rPr>
-          <w:rFonts w:ascii="Georgia" w:cs="Georgia" w:eastAsia="Georgia" w:hAnsi="Georgia"/>
-          <w:b w:val="false"/>
-          <w:bCs w:val="false"/>
-          <w:i w:val="false"/>
-          <w:iCs w:val="false"/>
-          <w:color w:val="1C1E21"/>
-          <w:sz w:val="21"/>
-          <w:szCs w:val="21"/>
-        </w:rPr>
-        <w:t xml:space="preserve">And every decision explains itself. When access is granted through a chain of three delegations, SecureMCP can show that chain. Denials are explained the same way — which missing permission caused it, not just that something was refused.</w:t>
-      </w:r>
-    </w:p>
-    <w:p>
-      <w:pPr>
-        <w:spacing w:after="150" w:line="276"/>
-      </w:pPr>
-      <w:r>
-        <w:rPr>
-          <w:rFonts w:ascii="Georgia" w:cs="Georgia" w:eastAsia="Georgia" w:hAnsi="Georgia"/>
-          <w:b w:val="false"/>
-          <w:bCs w:val="false"/>
-          <w:i w:val="false"/>
-          <w:iCs w:val="false"/>
-          <w:color w:val="1C1E21"/>
-          <w:sz w:val="21"/>
-          <w:szCs w:val="21"/>
-        </w:rPr>
-        <w:t xml:space="preserve">Both properties address the risk auditors call privilege creep: access that accumulates quietly until nobody can say why a given system can reach a given dataset.</w:t>
+        <w:t xml:space="preserve">Withdrawal follows the same logic. Revoking a permission automatically revokes everything derived from it. No orphaned access continues working because it was handed off before the withdrawal.</w:t>
+      </w:r>
+    </w:p>
+    <w:p>
+      <w:pPr>
+        <w:spacing w:after="150" w:line="276"/>
+      </w:pPr>
+      <w:r>
+        <w:rPr>
+          <w:rFonts w:ascii="Georgia" w:cs="Georgia" w:eastAsia="Georgia" w:hAnsi="Georgia"/>
+          <w:b w:val="false"/>
+          <w:bCs w:val="false"/>
+          <w:i w:val="false"/>
+          <w:iCs w:val="false"/>
+          <w:color w:val="1C1E21"/>
+          <w:sz w:val="21"/>
+          <w:szCs w:val="21"/>
+        </w:rPr>
+        <w:t xml:space="preserve">And every decision explains itself. When access is granted through a chain of three delegations, SecureMCP can show that chain. Denials are explained the same way — which missing permission caused it, not merely that something was refused.</w:t>
+      </w:r>
+    </w:p>
+    <w:p>
+      <w:pPr>
+        <w:spacing w:after="150" w:line="276"/>
+      </w:pPr>
+      <w:r>
+        <w:rPr>
+          <w:rFonts w:ascii="Georgia" w:cs="Georgia" w:eastAsia="Georgia" w:hAnsi="Georgia"/>
+          <w:b w:val="false"/>
+          <w:bCs w:val="false"/>
+          <w:i w:val="false"/>
+          <w:iCs w:val="false"/>
+          <w:color w:val="1C1E21"/>
+          <w:sz w:val="21"/>
+          <w:szCs w:val="21"/>
+        </w:rPr>
+        <w:t xml:space="preserve">Together these address the exposure auditors call privilege creep: access that accumulates quietly until nobody can say why a given system can reach a given dataset.</w:t>
       </w:r>
     </w:p>
     <w:p>
@@ -3289,7 +3240,7 @@
           <w:sz w:val="28"/>
           <w:szCs w:val="28"/>
         </w:rPr>
-        <w:t xml:space="preserve">8. Trust: Deciding Which Tools Belong</w:t>
+        <w:t xml:space="preserve">8. Trust in Third-Party Tools</w:t>
       </w:r>
     </w:p>
     <w:p>
@@ -3325,7 +3276,7 @@
           <w:sz w:val="21"/>
           <w:szCs w:val="21"/>
         </w:rPr>
-        <w:t xml:space="preserve">SecureMCP handles this with a chain that will look familiar to anyone who has thought about app store review or food safety inspection.</w:t>
+        <w:t xml:space="preserve">SecureMCP handles this with a chain that will be familiar to anyone who has considered app store review or food safety inspection.</w:t>
       </w:r>
     </w:p>
     <w:p>
@@ -3356,7 +3307,7 @@
           <w:sz w:val="21"/>
           <w:szCs w:val="21"/>
         </w:rPr>
-        <w:t xml:space="preserve"> Which resources it needs, what behaviour to expect.</w:t>
+        <w:t xml:space="preserve"> Which resources it needs, and what behaviour to expect.</w:t>
       </w:r>
     </w:p>
     <w:p>
@@ -3418,7 +3369,7 @@
           <w:sz w:val="21"/>
           <w:szCs w:val="21"/>
         </w:rPr>
-        <w:t xml:space="preserve"> By default, a certification without a valid signature cannot improve a tool's standing at all. An unverifiable claim has no commercial value inside the system, which is exactly the property that makes certification meaningful.</w:t>
+        <w:t xml:space="preserve"> By default, a certification without a valid signature cannot improve a tool's standing at all. An unverifiable claim carries no weight inside the system, which is what makes certification meaningful.</w:t>
       </w:r>
     </w:p>
     <w:p>
@@ -3898,7 +3849,7 @@
           <w:sz w:val="21"/>
           <w:szCs w:val="21"/>
         </w:rPr>
-        <w:t xml:space="preserve"> A revocation list pulls a tool out of service immediately. Where organisations have chosen to federate, a recall can propagate to peers — but each organisation's own list remains authoritative. A peer can inform a recall decision; it cannot make one on another organisation's behalf. That distinction is what makes federation acceptable to security teams who would otherwise refuse to participate.</w:t>
+        <w:t xml:space="preserve"> A revocation list pulls a tool out of service immediately. Where organisations have chosen to federate, a recall can propagate to peers — but each organisation's own list remains authoritative. A peer can inform a recall decision; it cannot make one on another organisation's behalf. That distinction is what makes federation acceptable to security teams who would otherwise decline to participate.</w:t>
       </w:r>
     </w:p>
     <w:p>
@@ -4024,38 +3975,25 @@
           <w:sz w:val="21"/>
           <w:szCs w:val="21"/>
         </w:rPr>
-        <w:t xml:space="preserve">The practical difference is in how an audit goes. "Show me how you prevent your AI agent from touching patient data without authorisation" is normally answered with a document describing intent, followed by weeks of evidence gathering. Here it is answered with a report generated from the system's own records.</w:t>
-      </w:r>
-    </w:p>
-    <w:p>
-      <w:pPr>
-        <w:spacing w:after="150" w:line="276"/>
-      </w:pPr>
-      <w:r>
-        <w:rPr>
-          <w:rFonts w:ascii="Georgia" w:cs="Georgia" w:eastAsia="Georgia" w:hAnsi="Georgia"/>
-          <w:b/>
-          <w:bCs/>
-          <w:i w:val="false"/>
-          <w:iCs w:val="false"/>
-          <w:color w:val="1C1E21"/>
-          <w:sz w:val="21"/>
-          <w:szCs w:val="21"/>
-        </w:rPr>
-        <w:t xml:space="preserve">An important accuracy point for anyone writing copy.</w:t>
-      </w:r>
-      <w:r>
-        <w:rPr>
-          <w:rFonts w:ascii="Georgia" w:cs="Georgia" w:eastAsia="Georgia" w:hAnsi="Georgia"/>
-          <w:b w:val="false"/>
-          <w:bCs w:val="false"/>
-          <w:i w:val="false"/>
-          <w:iCs w:val="false"/>
-          <w:color w:val="1C1E21"/>
-          <w:sz w:val="21"/>
-          <w:szCs w:val="21"/>
-        </w:rPr>
-        <w:t xml:space="preserve"> SecureMCP helps an organisation implement and evidence controls that map to these frameworks. It does not make anyone compliant, and it is not a certification. Compliance is an organisational outcome involving process, people, and an auditor. Overstating this is the single easiest way to create a problem for the account team later — see section 12.</w:t>
+        <w:t xml:space="preserve">The practical difference shows up in how an audit proceeds. A question such as "how is an AI agent prevented from touching patient data without authorisation?" is normally answered with a document describing intent, followed by weeks of evidence gathering. Here it is answered with a report generated from the system's own records.</w:t>
+      </w:r>
+    </w:p>
+    <w:p>
+      <w:pPr>
+        <w:spacing w:after="150" w:line="276"/>
+      </w:pPr>
+      <w:r>
+        <w:rPr>
+          <w:rFonts w:ascii="Georgia" w:cs="Georgia" w:eastAsia="Georgia" w:hAnsi="Georgia"/>
+          <w:b w:val="false"/>
+          <w:bCs w:val="false"/>
+          <w:i w:val="false"/>
+          <w:iCs w:val="false"/>
+          <w:color w:val="1C1E21"/>
+          <w:sz w:val="21"/>
+          <w:szCs w:val="21"/>
+        </w:rPr>
+        <w:t xml:space="preserve">One point of precision: SecureMCP helps an organisation implement and evidence controls that map to these frameworks. It does not by itself make an organisation compliant, and it is not a certification. Compliance is an organisational outcome involving process, people, and an auditor.</w:t>
       </w:r>
     </w:p>
     <w:p>
@@ -4652,7 +4590,7 @@
                 <w:sz w:val="18"/>
                 <w:szCs w:val="18"/>
               </w:rPr>
-              <w:t xml:space="preserve">Full stack, with an OS-level sandbox alongside (section 10)</w:t>
+              <w:t xml:space="preserve">Full stack, with an operating-system sandbox alongside (section 10)</w:t>
             </w:r>
           </w:p>
         </w:tc>
@@ -4693,25 +4631,25 @@
           <w:sz w:val="28"/>
           <w:szCs w:val="28"/>
         </w:rPr>
-        <w:t xml:space="preserve">10. What SecureMCP Does Not Do</w:t>
-      </w:r>
-    </w:p>
-    <w:p>
-      <w:pPr>
-        <w:spacing w:after="150" w:line="276"/>
-      </w:pPr>
-      <w:r>
-        <w:rPr>
-          <w:rFonts w:ascii="Georgia" w:cs="Georgia" w:eastAsia="Georgia" w:hAnsi="Georgia"/>
-          <w:b w:val="false"/>
-          <w:bCs w:val="false"/>
-          <w:i w:val="false"/>
-          <w:iCs w:val="false"/>
-          <w:color w:val="1C1E21"/>
-          <w:sz w:val="21"/>
-          <w:szCs w:val="21"/>
-        </w:rPr>
-        <w:t xml:space="preserve">This section exists because governance products fail commercially when their claims exceed their behaviour. A buyer who discovers an overstated claim during evaluation stops trusting everything else on the slide. Stated plainly and early, these same points build credibility — they demonstrate that the boundaries were mapped deliberately.</w:t>
+        <w:t xml:space="preserve">10. Scope and Limitations</w:t>
+      </w:r>
+    </w:p>
+    <w:p>
+      <w:pPr>
+        <w:spacing w:after="150" w:line="276"/>
+      </w:pPr>
+      <w:r>
+        <w:rPr>
+          <w:rFonts w:ascii="Georgia" w:cs="Georgia" w:eastAsia="Georgia" w:hAnsi="Georgia"/>
+          <w:b w:val="false"/>
+          <w:bCs w:val="false"/>
+          <w:i w:val="false"/>
+          <w:iCs w:val="false"/>
+          <w:color w:val="1C1E21"/>
+          <w:sz w:val="21"/>
+          <w:szCs w:val="21"/>
+        </w:rPr>
+        <w:t xml:space="preserve">A governance layer is only as good as the accuracy of its claims. These are the points where SecureMCP's guarantees stop, stated plainly so that a real boundary can be placed where one is needed.</w:t>
       </w:r>
     </w:p>
     <w:p>
@@ -4742,25 +4680,25 @@
           <w:sz w:val="21"/>
           <w:szCs w:val="21"/>
         </w:rPr>
-        <w:t xml:space="preserve"> This is the most important one. A tool declares how it will behave, and SecureMCP checks it against that declaration and records divergence. But the tool has to participate. A tool deliberately built to ignore the rules is not stopped by this layer.</w:t>
-      </w:r>
-    </w:p>
-    <w:p>
-      <w:pPr>
-        <w:spacing w:after="150" w:line="276"/>
-      </w:pPr>
-      <w:r>
-        <w:rPr>
-          <w:rFonts w:ascii="Georgia" w:cs="Georgia" w:eastAsia="Georgia" w:hAnsi="Georgia"/>
-          <w:b w:val="false"/>
-          <w:bCs w:val="false"/>
-          <w:i w:val="false"/>
-          <w:iCs w:val="false"/>
-          <w:color w:val="1C1E21"/>
-          <w:sz w:val="21"/>
-          <w:szCs w:val="21"/>
-        </w:rPr>
-        <w:t xml:space="preserve">The honest positioning: SecureMCP's sandbox gives visibility and accountability for tools that cooperate. For genuine containment, run tools inside a real operating-system sandbox and use SecureMCP as the meaning-aware layer on top. That combination is stronger than either alone, and it is a better sales story than an overstated claim, because it is one the customer's own security team will agree with.</w:t>
+        <w:t xml:space="preserve"> This is the most important one. A tool declares how it will behave, and SecureMCP checks it against that declaration and records any divergence. But the tool has to participate. A tool deliberately built to ignore the rules is not stopped by this layer.</w:t>
+      </w:r>
+    </w:p>
+    <w:p>
+      <w:pPr>
+        <w:spacing w:after="150" w:line="276"/>
+      </w:pPr>
+      <w:r>
+        <w:rPr>
+          <w:rFonts w:ascii="Georgia" w:cs="Georgia" w:eastAsia="Georgia" w:hAnsi="Georgia"/>
+          <w:b w:val="false"/>
+          <w:bCs w:val="false"/>
+          <w:i w:val="false"/>
+          <w:iCs w:val="false"/>
+          <w:color w:val="1C1E21"/>
+          <w:sz w:val="21"/>
+          <w:szCs w:val="21"/>
+        </w:rPr>
+        <w:t xml:space="preserve">The correct pairing is to run tools inside a real operating-system sandbox for containment, with SecureMCP as the meaning-aware layer on top — one that understands that a given action touches health records, in production, at high risk. That combination is stronger than either alone.</w:t>
       </w:r>
     </w:p>
     <w:p>
@@ -4791,7 +4729,7 @@
           <w:sz w:val="21"/>
           <w:szCs w:val="21"/>
         </w:rPr>
-        <w:t xml:space="preserve"> If agreement evaluation itself errors, terms are accepted rather than rejected — the opposite of the rule engine's behaviour. Because the rule engine runs first and does block on failure, the categorical protections still hold. But agreements should not be sold as the primary control.</w:t>
+        <w:t xml:space="preserve"> If agreement evaluation itself errors, terms are accepted rather than rejected — the opposite of the rule engine's behaviour. Because the rule engine runs first and does deny on failure, the categorical protections still hold. Agreements should not be relied on as the primary control.</w:t>
       </w:r>
     </w:p>
     <w:p>
@@ -4809,20 +4747,20 @@
           <w:sz w:val="21"/>
           <w:szCs w:val="21"/>
         </w:rPr>
-        <w:t xml:space="preserve">There is a development-only setting that must never ship.</w:t>
-      </w:r>
-      <w:r>
-        <w:rPr>
-          <w:rFonts w:ascii="Georgia" w:cs="Georgia" w:eastAsia="Georgia" w:hAnsi="Georgia"/>
-          <w:b w:val="false"/>
-          <w:bCs w:val="false"/>
-          <w:i w:val="false"/>
-          <w:iCs w:val="false"/>
-          <w:color w:val="1C1E21"/>
-          <w:sz w:val="21"/>
-          <w:szCs w:val="21"/>
-        </w:rPr>
-        <w:t xml:space="preserve"> A configuration option allows unsigned certifications to report as valid. It exists for local development and testing. In production it produces claims that cannot be checked. It defaults to off, and it should stay off.</w:t>
+        <w:t xml:space="preserve">One development setting must never reach production.</w:t>
+      </w:r>
+      <w:r>
+        <w:rPr>
+          <w:rFonts w:ascii="Georgia" w:cs="Georgia" w:eastAsia="Georgia" w:hAnsi="Georgia"/>
+          <w:b w:val="false"/>
+          <w:bCs w:val="false"/>
+          <w:i w:val="false"/>
+          <w:iCs w:val="false"/>
+          <w:color w:val="1C1E21"/>
+          <w:sz w:val="21"/>
+          <w:szCs w:val="21"/>
+        </w:rPr>
+        <w:t xml:space="preserve"> A configuration option allows unsigned certifications to report as valid. It exists for local development and testing; in production it would produce claims that cannot be checked. It defaults to off and should remain off.</w:t>
       </w:r>
     </w:p>
     <w:p>
@@ -4853,7 +4791,7 @@
           <w:sz w:val="21"/>
           <w:szCs w:val="21"/>
         </w:rPr>
-        <w:t xml:space="preserve"> For local use, where the parent application is trusted, enforcement can be bypassed. It is off by default and warns loudly when combined with active rules.</w:t>
+        <w:t xml:space="preserve"> For local use, where the surrounding application is trusted, enforcement can be bypassed. It is off by default and warns loudly when combined with active rules.</w:t>
       </w:r>
     </w:p>
     <w:p>
@@ -4884,7 +4822,7 @@
           <w:sz w:val="21"/>
           <w:szCs w:val="21"/>
         </w:rPr>
-        <w:t xml:space="preserve"> SecureMCP tracks a short identifier to correlate activity across its records. That is a correlation key, not proof of identity. Authenticating who is really making a request is the authentication layer's job, and SecureMCP relies on it rather than replacing it.</w:t>
+        <w:t xml:space="preserve"> SecureMCP tracks a short identifier to correlate activity across its records. That is a correlation key, not proof of identity. Establishing who is really making a request is the authentication layer's responsibility, and SecureMCP relies on it rather than replacing it.</w:t>
       </w:r>
     </w:p>
     <w:p>
@@ -4902,20 +4840,20 @@
           <w:sz w:val="21"/>
           <w:szCs w:val="21"/>
         </w:rPr>
-        <w:t xml:space="preserve">Some numbers are estimates.</w:t>
-      </w:r>
-      <w:r>
-        <w:rPr>
-          <w:rFonts w:ascii="Georgia" w:cs="Georgia" w:eastAsia="Georgia" w:hAnsi="Georgia"/>
-          <w:b w:val="false"/>
-          <w:bCs w:val="false"/>
-          <w:i w:val="false"/>
-          <w:iCs w:val="false"/>
-          <w:color w:val="1C1E21"/>
-          <w:sz w:val="21"/>
-          <w:szCs w:val="21"/>
-        </w:rPr>
-        <w:t xml:space="preserve"> Usage counts are approximations, good for spotting unusual volume, not suitable for billing.</w:t>
+        <w:t xml:space="preserve">Some figures are estimates.</w:t>
+      </w:r>
+      <w:r>
+        <w:rPr>
+          <w:rFonts w:ascii="Georgia" w:cs="Georgia" w:eastAsia="Georgia" w:hAnsi="Georgia"/>
+          <w:b w:val="false"/>
+          <w:bCs w:val="false"/>
+          <w:i w:val="false"/>
+          <w:iCs w:val="false"/>
+          <w:color w:val="1C1E21"/>
+          <w:sz w:val="21"/>
+          <w:szCs w:val="21"/>
+        </w:rPr>
+        <w:t xml:space="preserve"> Usage counts are approximations — useful for spotting unusual volume, not suitable for billing.</w:t>
       </w:r>
     </w:p>
     <w:p>
@@ -4964,20 +4902,20 @@
           <w:sz w:val="21"/>
           <w:szCs w:val="21"/>
         </w:rPr>
-        <w:t xml:space="preserve">A known gap in one advanced configuration.</w:t>
-      </w:r>
-      <w:r>
-        <w:rPr>
-          <w:rFonts w:ascii="Georgia" w:cs="Georgia" w:eastAsia="Georgia" w:hAnsi="Georgia"/>
-          <w:b w:val="false"/>
-          <w:bCs w:val="false"/>
-          <w:i w:val="false"/>
-          <w:iCs w:val="false"/>
-          <w:color w:val="1C1E21"/>
-          <w:sz w:val="21"/>
-          <w:szCs w:val="21"/>
-        </w:rPr>
-        <w:t xml:space="preserve"> When federation and shared permissions are used together, the current start-up sequence does not connect the two as intended. It is documented, understood, and has a straightforward fix. Worth knowing so it is not discovered by a prospect first.</w:t>
+        <w:t xml:space="preserve">One advanced configuration has a known gap.</w:t>
+      </w:r>
+      <w:r>
+        <w:rPr>
+          <w:rFonts w:ascii="Georgia" w:cs="Georgia" w:eastAsia="Georgia" w:hAnsi="Georgia"/>
+          <w:b w:val="false"/>
+          <w:bCs w:val="false"/>
+          <w:i w:val="false"/>
+          <w:iCs w:val="false"/>
+          <w:color w:val="1C1E21"/>
+          <w:sz w:val="21"/>
+          <w:szCs w:val="21"/>
+        </w:rPr>
+        <w:t xml:space="preserve"> When federation and shared permissions are used together, the current start-up sequence does not connect the two as intended. It is documented, understood, and has a straightforward fix.</w:t>
       </w:r>
     </w:p>
     <w:p>
@@ -5010,25 +4948,25 @@
           <w:sz w:val="28"/>
           <w:szCs w:val="28"/>
         </w:rPr>
-        <w:t xml:space="preserve">11. Adoption: Start Small</w:t>
-      </w:r>
-    </w:p>
-    <w:p>
-      <w:pPr>
-        <w:spacing w:after="150" w:line="276"/>
-      </w:pPr>
-      <w:r>
-        <w:rPr>
-          <w:rFonts w:ascii="Georgia" w:cs="Georgia" w:eastAsia="Georgia" w:hAnsi="Georgia"/>
-          <w:b w:val="false"/>
-          <w:bCs w:val="false"/>
-          <w:i w:val="false"/>
-          <w:iCs w:val="false"/>
-          <w:color w:val="1C1E21"/>
-          <w:sz w:val="21"/>
-          <w:szCs w:val="21"/>
-        </w:rPr>
-        <w:t xml:space="preserve">Because every capability is independent, adoption does not require a platform decision. This is the most useful thing to know when a deal stalls on scope.</w:t>
+        <w:t xml:space="preserve">11. A Phased Adoption Path</w:t>
+      </w:r>
+    </w:p>
+    <w:p>
+      <w:pPr>
+        <w:spacing w:after="150" w:line="276"/>
+      </w:pPr>
+      <w:r>
+        <w:rPr>
+          <w:rFonts w:ascii="Georgia" w:cs="Georgia" w:eastAsia="Georgia" w:hAnsi="Georgia"/>
+          <w:b w:val="false"/>
+          <w:bCs w:val="false"/>
+          <w:i w:val="false"/>
+          <w:iCs w:val="false"/>
+          <w:color w:val="1C1E21"/>
+          <w:sz w:val="21"/>
+          <w:szCs w:val="21"/>
+        </w:rPr>
+        <w:t xml:space="preserve">Because every capability is independent, adoption does not require a single platform decision.</w:t>
       </w:r>
     </w:p>
     <w:p>
@@ -5046,20 +4984,20 @@
           <w:sz w:val="21"/>
           <w:szCs w:val="21"/>
         </w:rPr>
-        <w:t xml:space="preserve">Stage 1 — See what is happening.</w:t>
-      </w:r>
-      <w:r>
-        <w:rPr>
-          <w:rFonts w:ascii="Georgia" w:cs="Georgia" w:eastAsia="Georgia" w:hAnsi="Georgia"/>
-          <w:b w:val="false"/>
-          <w:bCs w:val="false"/>
-          <w:i w:val="false"/>
-          <w:iCs w:val="false"/>
-          <w:color w:val="1C1E21"/>
-          <w:sz w:val="21"/>
-          <w:szCs w:val="21"/>
-        </w:rPr>
-        <w:t xml:space="preserve"> Turn on the record. Nothing is blocked, nothing breaks, and the customer gets a verifiable log of every action their agents take. This is the easiest possible yes: no behaviour change, immediate audit value. It also tends to be persuasive on its own, because the first look at what agents are actually doing is usually surprising.</w:t>
+        <w:t xml:space="preserve">Stage 1 — Establish visibility.</w:t>
+      </w:r>
+      <w:r>
+        <w:rPr>
+          <w:rFonts w:ascii="Georgia" w:cs="Georgia" w:eastAsia="Georgia" w:hAnsi="Georgia"/>
+          <w:b w:val="false"/>
+          <w:bCs w:val="false"/>
+          <w:i w:val="false"/>
+          <w:iCs w:val="false"/>
+          <w:color w:val="1C1E21"/>
+          <w:sz w:val="21"/>
+          <w:szCs w:val="21"/>
+        </w:rPr>
+        <w:t xml:space="preserve"> Turn on the record. Nothing is blocked and nothing breaks, and the result is a verifiable log of every action the organisation's agents take. No behaviour changes, and the audit value is immediate. The first look at what agents are actually doing is usually itself informative.</w:t>
       </w:r>
     </w:p>
     <w:p>
@@ -5090,7 +5028,7 @@
           <w:sz w:val="21"/>
           <w:szCs w:val="21"/>
         </w:rPr>
-        <w:t xml:space="preserve"> With visibility established, the customer can see which actions matter and write policy against reality rather than speculation. Rules can be tested in simulation against real recorded scenarios before going live — which removes the "what if we block something important?" objection.</w:t>
+        <w:t xml:space="preserve"> With visibility established, policy can be written against observed reality rather than speculation. Rules can be tested in simulation against real recorded scenarios before going live, which answers the natural concern that a new rule might block something important.</w:t>
       </w:r>
     </w:p>
     <w:p>
@@ -5108,20 +5046,20 @@
           <w:sz w:val="21"/>
           <w:szCs w:val="21"/>
         </w:rPr>
-        <w:t xml:space="preserve">Stage 3 — Add permissions and behaviour watch.</w:t>
-      </w:r>
-      <w:r>
-        <w:rPr>
-          <w:rFonts w:ascii="Georgia" w:cs="Georgia" w:eastAsia="Georgia" w:hAnsi="Georgia"/>
-          <w:b w:val="false"/>
-          <w:bCs w:val="false"/>
-          <w:i w:val="false"/>
-          <w:iCs w:val="false"/>
-          <w:color w:val="1C1E21"/>
-          <w:sz w:val="21"/>
-          <w:szCs w:val="21"/>
-        </w:rPr>
-        <w:t xml:space="preserve"> Owner consent for sensitive resources, plus automatic response to behaviour that changes shape.</w:t>
+        <w:t xml:space="preserve">Stage 3 — Add permissions and behaviour monitoring.</w:t>
+      </w:r>
+      <w:r>
+        <w:rPr>
+          <w:rFonts w:ascii="Georgia" w:cs="Georgia" w:eastAsia="Georgia" w:hAnsi="Georgia"/>
+          <w:b w:val="false"/>
+          <w:bCs w:val="false"/>
+          <w:i w:val="false"/>
+          <w:iCs w:val="false"/>
+          <w:color w:val="1C1E21"/>
+          <w:sz w:val="21"/>
+          <w:szCs w:val="21"/>
+        </w:rPr>
+        <w:t xml:space="preserve"> Owner consent for sensitive resources, plus automatic response when behaviour changes shape.</w:t>
       </w:r>
     </w:p>
     <w:p>
@@ -5152,7 +5090,7 @@
           <w:sz w:val="21"/>
           <w:szCs w:val="21"/>
         </w:rPr>
-        <w:t xml:space="preserve"> Relevant once the number of tools grows, or once third-party tools are in play.</w:t>
+        <w:t xml:space="preserve"> Relevant once the number of tools grows, or once third-party tools are in use.</w:t>
       </w:r>
     </w:p>
     <w:p>
@@ -5203,757 +5141,7 @@
           <w:sz w:val="28"/>
           <w:szCs w:val="28"/>
         </w:rPr>
-        <w:t xml:space="preserve">12. How to Describe It Accurately</w:t>
-      </w:r>
-    </w:p>
-    <w:p>
-      <w:pPr>
-        <w:spacing w:after="150" w:line="276"/>
-      </w:pPr>
-      <w:r>
-        <w:rPr>
-          <w:rFonts w:ascii="Georgia" w:cs="Georgia" w:eastAsia="Georgia" w:hAnsi="Georgia"/>
-          <w:b w:val="false"/>
-          <w:bCs w:val="false"/>
-          <w:i w:val="false"/>
-          <w:iCs w:val="false"/>
-          <w:color w:val="1C1E21"/>
-          <w:sz w:val="21"/>
-          <w:szCs w:val="21"/>
-        </w:rPr>
-        <w:t xml:space="preserve">Governance products are unusually easy to oversell, because the language of security invites absolutes. These pairings keep claims defensible.</w:t>
-      </w:r>
-    </w:p>
-    <w:tbl>
-      <w:tblPr>
-        <w:tblW w:type="dxa" w:w="10080"/>
-        <w:tblBorders>
-          <w:top w:val="single" w:color="B9BEC6" w:sz="4"/>
-          <w:left w:val="single" w:color="D7DAE0" w:sz="2"/>
-          <w:bottom w:val="single" w:color="B9BEC6" w:sz="4"/>
-          <w:right w:val="single" w:color="D7DAE0" w:sz="2"/>
-          <w:insideH w:val="single" w:color="D7DAE0" w:sz="2"/>
-          <w:insideV w:val="single" w:color="D7DAE0" w:sz="2"/>
-        </w:tblBorders>
-      </w:tblPr>
-      <w:tblGrid>
-        <w:gridCol w:w="2150"/>
-        <w:gridCol w:w="7930"/>
-      </w:tblGrid>
-      <w:tr>
-        <w:trPr>
-          <w:tblHeader/>
-        </w:trPr>
-        <w:tc>
-          <w:tcPr>
-            <w:tcW w:type="dxa" w:w="2150"/>
-            <w:shd w:fill="F2F3F5" w:color="auto" w:val="clear"/>
-            <w:tcMar>
-              <w:top w:type="dxa" w:w="70"/>
-              <w:left w:type="dxa" w:w="110"/>
-              <w:bottom w:type="dxa" w:w="70"/>
-              <w:right w:type="dxa" w:w="110"/>
-            </w:tcMar>
-          </w:tcPr>
-          <w:p>
-            <w:pPr>
-              <w:spacing w:after="0" w:before="0" w:line="240"/>
-              <w:jc w:val="left"/>
-            </w:pPr>
-            <w:r>
-              <w:rPr>
-                <w:rFonts w:ascii="Arial" w:cs="Arial" w:eastAsia="Arial" w:hAnsi="Arial"/>
-                <w:b/>
-                <w:bCs/>
-                <w:i w:val="false"/>
-                <w:iCs w:val="false"/>
-                <w:color w:val="1C1E21"/>
-                <w:sz w:val="17"/>
-                <w:szCs w:val="17"/>
-              </w:rPr>
-              <w:t xml:space="preserve">Do not say</w:t>
-            </w:r>
-          </w:p>
-        </w:tc>
-        <w:tc>
-          <w:tcPr>
-            <w:tcW w:type="dxa" w:w="7930"/>
-            <w:shd w:fill="F2F3F5" w:color="auto" w:val="clear"/>
-            <w:tcMar>
-              <w:top w:type="dxa" w:w="70"/>
-              <w:left w:type="dxa" w:w="110"/>
-              <w:bottom w:type="dxa" w:w="70"/>
-              <w:right w:type="dxa" w:w="110"/>
-            </w:tcMar>
-          </w:tcPr>
-          <w:p>
-            <w:pPr>
-              <w:spacing w:after="0" w:before="0" w:line="240"/>
-              <w:jc w:val="left"/>
-            </w:pPr>
-            <w:r>
-              <w:rPr>
-                <w:rFonts w:ascii="Arial" w:cs="Arial" w:eastAsia="Arial" w:hAnsi="Arial"/>
-                <w:b/>
-                <w:bCs/>
-                <w:i w:val="false"/>
-                <w:iCs w:val="false"/>
-                <w:color w:val="1C1E21"/>
-                <w:sz w:val="17"/>
-                <w:szCs w:val="17"/>
-              </w:rPr>
-              <w:t xml:space="preserve">Say instead</w:t>
-            </w:r>
-          </w:p>
-        </w:tc>
-      </w:tr>
-      <w:tr>
-        <w:tc>
-          <w:tcPr>
-            <w:tcW w:type="dxa" w:w="2150"/>
-            <w:tcMar>
-              <w:top w:type="dxa" w:w="70"/>
-              <w:left w:type="dxa" w:w="110"/>
-              <w:bottom w:type="dxa" w:w="70"/>
-              <w:right w:type="dxa" w:w="110"/>
-            </w:tcMar>
-          </w:tcPr>
-          <w:p>
-            <w:pPr>
-              <w:spacing w:after="0" w:before="0" w:line="240"/>
-              <w:jc w:val="left"/>
-            </w:pPr>
-            <w:r>
-              <w:rPr>
-                <w:rFonts w:ascii="Georgia" w:cs="Georgia" w:eastAsia="Georgia" w:hAnsi="Georgia"/>
-                <w:b w:val="false"/>
-                <w:bCs w:val="false"/>
-                <w:i w:val="false"/>
-                <w:iCs w:val="false"/>
-                <w:color w:val="1C1E21"/>
-                <w:sz w:val="18"/>
-                <w:szCs w:val="18"/>
-              </w:rPr>
-              <w:t xml:space="preserve">"Sandboxes untrusted tools"</w:t>
-            </w:r>
-          </w:p>
-        </w:tc>
-        <w:tc>
-          <w:tcPr>
-            <w:tcW w:type="dxa" w:w="7930"/>
-            <w:tcMar>
-              <w:top w:type="dxa" w:w="70"/>
-              <w:left w:type="dxa" w:w="110"/>
-              <w:bottom w:type="dxa" w:w="70"/>
-              <w:right w:type="dxa" w:w="110"/>
-            </w:tcMar>
-          </w:tcPr>
-          <w:p>
-            <w:pPr>
-              <w:spacing w:after="0" w:before="0" w:line="240"/>
-              <w:jc w:val="left"/>
-            </w:pPr>
-            <w:r>
-              <w:rPr>
-                <w:rFonts w:ascii="Georgia" w:cs="Georgia" w:eastAsia="Georgia" w:hAnsi="Georgia"/>
-                <w:b w:val="false"/>
-                <w:bCs w:val="false"/>
-                <w:i w:val="false"/>
-                <w:iCs w:val="false"/>
-                <w:color w:val="1C1E21"/>
-                <w:sz w:val="18"/>
-                <w:szCs w:val="18"/>
-              </w:rPr>
-              <w:t xml:space="preserve">"Provides declared behaviour rules and visibility for cooperating tools; pair with OS-level isolation for containment"</w:t>
-            </w:r>
-          </w:p>
-        </w:tc>
-      </w:tr>
-      <w:tr>
-        <w:tc>
-          <w:tcPr>
-            <w:tcW w:type="dxa" w:w="2150"/>
-            <w:shd w:fill="FAFBFC" w:color="auto" w:val="clear"/>
-            <w:tcMar>
-              <w:top w:type="dxa" w:w="70"/>
-              <w:left w:type="dxa" w:w="110"/>
-              <w:bottom w:type="dxa" w:w="70"/>
-              <w:right w:type="dxa" w:w="110"/>
-            </w:tcMar>
-          </w:tcPr>
-          <w:p>
-            <w:pPr>
-              <w:spacing w:after="0" w:before="0" w:line="240"/>
-              <w:jc w:val="left"/>
-            </w:pPr>
-            <w:r>
-              <w:rPr>
-                <w:rFonts w:ascii="Georgia" w:cs="Georgia" w:eastAsia="Georgia" w:hAnsi="Georgia"/>
-                <w:b w:val="false"/>
-                <w:bCs w:val="false"/>
-                <w:i w:val="false"/>
-                <w:iCs w:val="false"/>
-                <w:color w:val="1C1E21"/>
-                <w:sz w:val="18"/>
-                <w:szCs w:val="18"/>
-              </w:rPr>
-              <w:t xml:space="preserve">"Prevents malicious tools"</w:t>
-            </w:r>
-          </w:p>
-        </w:tc>
-        <w:tc>
-          <w:tcPr>
-            <w:tcW w:type="dxa" w:w="7930"/>
-            <w:shd w:fill="FAFBFC" w:color="auto" w:val="clear"/>
-            <w:tcMar>
-              <w:top w:type="dxa" w:w="70"/>
-              <w:left w:type="dxa" w:w="110"/>
-              <w:bottom w:type="dxa" w:w="70"/>
-              <w:right w:type="dxa" w:w="110"/>
-            </w:tcMar>
-          </w:tcPr>
-          <w:p>
-            <w:pPr>
-              <w:spacing w:after="0" w:before="0" w:line="240"/>
-              <w:jc w:val="left"/>
-            </w:pPr>
-            <w:r>
-              <w:rPr>
-                <w:rFonts w:ascii="Georgia" w:cs="Georgia" w:eastAsia="Georgia" w:hAnsi="Georgia"/>
-                <w:b w:val="false"/>
-                <w:bCs w:val="false"/>
-                <w:i w:val="false"/>
-                <w:iCs w:val="false"/>
-                <w:color w:val="1C1E21"/>
-                <w:sz w:val="18"/>
-                <w:szCs w:val="18"/>
-              </w:rPr>
-              <w:t xml:space="preserve">"Detects and records divergence from declared behaviour, and can revoke a tool immediately"</w:t>
-            </w:r>
-          </w:p>
-        </w:tc>
-      </w:tr>
-      <w:tr>
-        <w:tc>
-          <w:tcPr>
-            <w:tcW w:type="dxa" w:w="2150"/>
-            <w:tcMar>
-              <w:top w:type="dxa" w:w="70"/>
-              <w:left w:type="dxa" w:w="110"/>
-              <w:bottom w:type="dxa" w:w="70"/>
-              <w:right w:type="dxa" w:w="110"/>
-            </w:tcMar>
-          </w:tcPr>
-          <w:p>
-            <w:pPr>
-              <w:spacing w:after="0" w:before="0" w:line="240"/>
-              <w:jc w:val="left"/>
-            </w:pPr>
-            <w:r>
-              <w:rPr>
-                <w:rFonts w:ascii="Georgia" w:cs="Georgia" w:eastAsia="Georgia" w:hAnsi="Georgia"/>
-                <w:b w:val="false"/>
-                <w:bCs w:val="false"/>
-                <w:i w:val="false"/>
-                <w:iCs w:val="false"/>
-                <w:color w:val="1C1E21"/>
-                <w:sz w:val="18"/>
-                <w:szCs w:val="18"/>
-              </w:rPr>
-              <w:t xml:space="preserve">"Makes you HIPAA compliant"</w:t>
-            </w:r>
-          </w:p>
-        </w:tc>
-        <w:tc>
-          <w:tcPr>
-            <w:tcW w:type="dxa" w:w="7930"/>
-            <w:tcMar>
-              <w:top w:type="dxa" w:w="70"/>
-              <w:left w:type="dxa" w:w="110"/>
-              <w:bottom w:type="dxa" w:w="70"/>
-              <w:right w:type="dxa" w:w="110"/>
-            </w:tcMar>
-          </w:tcPr>
-          <w:p>
-            <w:pPr>
-              <w:spacing w:after="0" w:before="0" w:line="240"/>
-              <w:jc w:val="left"/>
-            </w:pPr>
-            <w:r>
-              <w:rPr>
-                <w:rFonts w:ascii="Georgia" w:cs="Georgia" w:eastAsia="Georgia" w:hAnsi="Georgia"/>
-                <w:b w:val="false"/>
-                <w:bCs w:val="false"/>
-                <w:i w:val="false"/>
-                <w:iCs w:val="false"/>
-                <w:color w:val="1C1E21"/>
-                <w:sz w:val="18"/>
-                <w:szCs w:val="18"/>
-              </w:rPr>
-              <w:t xml:space="preserve">"Helps implement and evidence controls that map to HIPAA requirements"</w:t>
-            </w:r>
-          </w:p>
-        </w:tc>
-      </w:tr>
-      <w:tr>
-        <w:tc>
-          <w:tcPr>
-            <w:tcW w:type="dxa" w:w="2150"/>
-            <w:shd w:fill="FAFBFC" w:color="auto" w:val="clear"/>
-            <w:tcMar>
-              <w:top w:type="dxa" w:w="70"/>
-              <w:left w:type="dxa" w:w="110"/>
-              <w:bottom w:type="dxa" w:w="70"/>
-              <w:right w:type="dxa" w:w="110"/>
-            </w:tcMar>
-          </w:tcPr>
-          <w:p>
-            <w:pPr>
-              <w:spacing w:after="0" w:before="0" w:line="240"/>
-              <w:jc w:val="left"/>
-            </w:pPr>
-            <w:r>
-              <w:rPr>
-                <w:rFonts w:ascii="Georgia" w:cs="Georgia" w:eastAsia="Georgia" w:hAnsi="Georgia"/>
-                <w:b w:val="false"/>
-                <w:bCs w:val="false"/>
-                <w:i w:val="false"/>
-                <w:iCs w:val="false"/>
-                <w:color w:val="1C1E21"/>
-                <w:sz w:val="18"/>
-                <w:szCs w:val="18"/>
-              </w:rPr>
-              <w:t xml:space="preserve">"Complete AI security"</w:t>
-            </w:r>
-          </w:p>
-        </w:tc>
-        <w:tc>
-          <w:tcPr>
-            <w:tcW w:type="dxa" w:w="7930"/>
-            <w:shd w:fill="FAFBFC" w:color="auto" w:val="clear"/>
-            <w:tcMar>
-              <w:top w:type="dxa" w:w="70"/>
-              <w:left w:type="dxa" w:w="110"/>
-              <w:bottom w:type="dxa" w:w="70"/>
-              <w:right w:type="dxa" w:w="110"/>
-            </w:tcMar>
-          </w:tcPr>
-          <w:p>
-            <w:pPr>
-              <w:spacing w:after="0" w:before="0" w:line="240"/>
-              <w:jc w:val="left"/>
-            </w:pPr>
-            <w:r>
-              <w:rPr>
-                <w:rFonts w:ascii="Georgia" w:cs="Georgia" w:eastAsia="Georgia" w:hAnsi="Georgia"/>
-                <w:b w:val="false"/>
-                <w:bCs w:val="false"/>
-                <w:i w:val="false"/>
-                <w:iCs w:val="false"/>
-                <w:color w:val="1C1E21"/>
-                <w:sz w:val="18"/>
-                <w:szCs w:val="18"/>
-              </w:rPr>
-              <w:t xml:space="preserve">"Governs what agents are allowed to do, and proves what they did"</w:t>
-            </w:r>
-          </w:p>
-        </w:tc>
-      </w:tr>
-      <w:tr>
-        <w:tc>
-          <w:tcPr>
-            <w:tcW w:type="dxa" w:w="2150"/>
-            <w:tcMar>
-              <w:top w:type="dxa" w:w="70"/>
-              <w:left w:type="dxa" w:w="110"/>
-              <w:bottom w:type="dxa" w:w="70"/>
-              <w:right w:type="dxa" w:w="110"/>
-            </w:tcMar>
-          </w:tcPr>
-          <w:p>
-            <w:pPr>
-              <w:spacing w:after="0" w:before="0" w:line="240"/>
-              <w:jc w:val="left"/>
-            </w:pPr>
-            <w:r>
-              <w:rPr>
-                <w:rFonts w:ascii="Georgia" w:cs="Georgia" w:eastAsia="Georgia" w:hAnsi="Georgia"/>
-                <w:b w:val="false"/>
-                <w:bCs w:val="false"/>
-                <w:i w:val="false"/>
-                <w:iCs w:val="false"/>
-                <w:color w:val="1C1E21"/>
-                <w:sz w:val="18"/>
-                <w:szCs w:val="18"/>
-              </w:rPr>
-              <w:t xml:space="preserve">"Immutable"</w:t>
-            </w:r>
-          </w:p>
-        </w:tc>
-        <w:tc>
-          <w:tcPr>
-            <w:tcW w:type="dxa" w:w="7930"/>
-            <w:tcMar>
-              <w:top w:type="dxa" w:w="70"/>
-              <w:left w:type="dxa" w:w="110"/>
-              <w:bottom w:type="dxa" w:w="70"/>
-              <w:right w:type="dxa" w:w="110"/>
-            </w:tcMar>
-          </w:tcPr>
-          <w:p>
-            <w:pPr>
-              <w:spacing w:after="0" w:before="0" w:line="240"/>
-              <w:jc w:val="left"/>
-            </w:pPr>
-            <w:r>
-              <w:rPr>
-                <w:rFonts w:ascii="Georgia" w:cs="Georgia" w:eastAsia="Georgia" w:hAnsi="Georgia"/>
-                <w:b w:val="false"/>
-                <w:bCs w:val="false"/>
-                <w:i w:val="false"/>
-                <w:iCs w:val="false"/>
-                <w:color w:val="1C1E21"/>
-                <w:sz w:val="18"/>
-                <w:szCs w:val="18"/>
-              </w:rPr>
-              <w:t xml:space="preserve">"Tamper-evident — alteration is detectable and independently verifiable"</w:t>
-            </w:r>
-          </w:p>
-        </w:tc>
-      </w:tr>
-      <w:tr>
-        <w:tc>
-          <w:tcPr>
-            <w:tcW w:type="dxa" w:w="2150"/>
-            <w:shd w:fill="FAFBFC" w:color="auto" w:val="clear"/>
-            <w:tcMar>
-              <w:top w:type="dxa" w:w="70"/>
-              <w:left w:type="dxa" w:w="110"/>
-              <w:bottom w:type="dxa" w:w="70"/>
-              <w:right w:type="dxa" w:w="110"/>
-            </w:tcMar>
-          </w:tcPr>
-          <w:p>
-            <w:pPr>
-              <w:spacing w:after="0" w:before="0" w:line="240"/>
-              <w:jc w:val="left"/>
-            </w:pPr>
-            <w:r>
-              <w:rPr>
-                <w:rFonts w:ascii="Georgia" w:cs="Georgia" w:eastAsia="Georgia" w:hAnsi="Georgia"/>
-                <w:b w:val="false"/>
-                <w:bCs w:val="false"/>
-                <w:i w:val="false"/>
-                <w:iCs w:val="false"/>
-                <w:color w:val="1C1E21"/>
-                <w:sz w:val="18"/>
-                <w:szCs w:val="18"/>
-              </w:rPr>
-              <w:t xml:space="preserve">"Authenticates agents"</w:t>
-            </w:r>
-          </w:p>
-        </w:tc>
-        <w:tc>
-          <w:tcPr>
-            <w:tcW w:type="dxa" w:w="7930"/>
-            <w:shd w:fill="FAFBFC" w:color="auto" w:val="clear"/>
-            <w:tcMar>
-              <w:top w:type="dxa" w:w="70"/>
-              <w:left w:type="dxa" w:w="110"/>
-              <w:bottom w:type="dxa" w:w="70"/>
-              <w:right w:type="dxa" w:w="110"/>
-            </w:tcMar>
-          </w:tcPr>
-          <w:p>
-            <w:pPr>
-              <w:spacing w:after="0" w:before="0" w:line="240"/>
-              <w:jc w:val="left"/>
-            </w:pPr>
-            <w:r>
-              <w:rPr>
-                <w:rFonts w:ascii="Georgia" w:cs="Georgia" w:eastAsia="Georgia" w:hAnsi="Georgia"/>
-                <w:b w:val="false"/>
-                <w:bCs w:val="false"/>
-                <w:i w:val="false"/>
-                <w:iCs w:val="false"/>
-                <w:color w:val="1C1E21"/>
-                <w:sz w:val="18"/>
-                <w:szCs w:val="18"/>
-              </w:rPr>
-              <w:t xml:space="preserve">"Works with your authentication layer; enforces what the authenticated party may do"</w:t>
-            </w:r>
-          </w:p>
-        </w:tc>
-      </w:tr>
-      <w:tr>
-        <w:tc>
-          <w:tcPr>
-            <w:tcW w:type="dxa" w:w="2150"/>
-            <w:tcMar>
-              <w:top w:type="dxa" w:w="70"/>
-              <w:left w:type="dxa" w:w="110"/>
-              <w:bottom w:type="dxa" w:w="70"/>
-              <w:right w:type="dxa" w:w="110"/>
-            </w:tcMar>
-          </w:tcPr>
-          <w:p>
-            <w:pPr>
-              <w:spacing w:after="0" w:before="0" w:line="240"/>
-              <w:jc w:val="left"/>
-            </w:pPr>
-            <w:r>
-              <w:rPr>
-                <w:rFonts w:ascii="Georgia" w:cs="Georgia" w:eastAsia="Georgia" w:hAnsi="Georgia"/>
-                <w:b w:val="false"/>
-                <w:bCs w:val="false"/>
-                <w:i w:val="false"/>
-                <w:iCs w:val="false"/>
-                <w:color w:val="1C1E21"/>
-                <w:sz w:val="18"/>
-                <w:szCs w:val="18"/>
-              </w:rPr>
-              <w:t xml:space="preserve">"Blocks all unauthorised access"</w:t>
-            </w:r>
-          </w:p>
-        </w:tc>
-        <w:tc>
-          <w:tcPr>
-            <w:tcW w:type="dxa" w:w="7930"/>
-            <w:tcMar>
-              <w:top w:type="dxa" w:w="70"/>
-              <w:left w:type="dxa" w:w="110"/>
-              <w:bottom w:type="dxa" w:w="70"/>
-              <w:right w:type="dxa" w:w="110"/>
-            </w:tcMar>
-          </w:tcPr>
-          <w:p>
-            <w:pPr>
-              <w:spacing w:after="0" w:before="0" w:line="240"/>
-              <w:jc w:val="left"/>
-            </w:pPr>
-            <w:r>
-              <w:rPr>
-                <w:rFonts w:ascii="Georgia" w:cs="Georgia" w:eastAsia="Georgia" w:hAnsi="Georgia"/>
-                <w:b w:val="false"/>
-                <w:bCs w:val="false"/>
-                <w:i w:val="false"/>
-                <w:iCs w:val="false"/>
-                <w:color w:val="1C1E21"/>
-                <w:sz w:val="18"/>
-                <w:szCs w:val="18"/>
-              </w:rPr>
-              <w:t xml:space="preserve">"Unauthorised capability is not exposed and not permitted, with rules failing closed"</w:t>
-            </w:r>
-          </w:p>
-        </w:tc>
-      </w:tr>
-    </w:tbl>
-    <w:p>
-      <w:pPr>
-        <w:spacing w:after="0" w:line="200"/>
-      </w:pPr>
-    </w:p>
-    <w:p>
-      <w:pPr>
-        <w:spacing w:after="150" w:line="276"/>
-      </w:pPr>
-      <w:r>
-        <w:rPr>
-          <w:rFonts w:ascii="Georgia" w:cs="Georgia" w:eastAsia="Georgia" w:hAnsi="Georgia"/>
-          <w:b w:val="false"/>
-          <w:bCs w:val="false"/>
-          <w:i w:val="false"/>
-          <w:iCs w:val="false"/>
-          <w:color w:val="1C1E21"/>
-          <w:sz w:val="21"/>
-          <w:szCs w:val="21"/>
-        </w:rPr>
-        <w:t xml:space="preserve">Three claims that are strong and fully supportable:</w:t>
-      </w:r>
-    </w:p>
-    <w:p>
-      <w:pPr>
-        <w:pStyle w:val="ListParagraph"/>
-        <w:numPr>
-          <w:ilvl w:val="0"/>
-          <w:numId w:val="3"/>
-        </w:numPr>
-        <w:spacing w:after="90" w:line="276"/>
-      </w:pPr>
-      <w:r>
-        <w:rPr>
-          <w:rFonts w:ascii="Georgia" w:cs="Georgia" w:eastAsia="Georgia" w:hAnsi="Georgia"/>
-          <w:b/>
-          <w:bCs/>
-          <w:i w:val="false"/>
-          <w:iCs w:val="false"/>
-          <w:color w:val="1C1E21"/>
-          <w:sz w:val="21"/>
-          <w:szCs w:val="21"/>
-        </w:rPr>
-        <w:t xml:space="preserve">Independent verification.</w:t>
-      </w:r>
-      <w:r>
-        <w:rPr>
-          <w:rFonts w:ascii="Georgia" w:cs="Georgia" w:eastAsia="Georgia" w:hAnsi="Georgia"/>
-          <w:b w:val="false"/>
-          <w:bCs w:val="false"/>
-          <w:i w:val="false"/>
-          <w:iCs w:val="false"/>
-          <w:color w:val="1C1E21"/>
-          <w:sz w:val="21"/>
-          <w:szCs w:val="21"/>
-        </w:rPr>
-        <w:t xml:space="preserve"> An outside party can verify the record without access to the running system. Few products in this space can say this.</w:t>
-      </w:r>
-    </w:p>
-    <w:p>
-      <w:pPr>
-        <w:pStyle w:val="ListParagraph"/>
-        <w:numPr>
-          <w:ilvl w:val="0"/>
-          <w:numId w:val="3"/>
-        </w:numPr>
-        <w:spacing w:after="90" w:line="276"/>
-      </w:pPr>
-      <w:r>
-        <w:rPr>
-          <w:rFonts w:ascii="Georgia" w:cs="Georgia" w:eastAsia="Georgia" w:hAnsi="Georgia"/>
-          <w:b/>
-          <w:bCs/>
-          <w:i w:val="false"/>
-          <w:iCs w:val="false"/>
-          <w:color w:val="1C1E21"/>
-          <w:sz w:val="21"/>
-          <w:szCs w:val="21"/>
-        </w:rPr>
-        <w:t xml:space="preserve">Permissions cannot expand.</w:t>
-      </w:r>
-      <w:r>
-        <w:rPr>
-          <w:rFonts w:ascii="Georgia" w:cs="Georgia" w:eastAsia="Georgia" w:hAnsi="Georgia"/>
-          <w:b w:val="false"/>
-          <w:bCs w:val="false"/>
-          <w:i w:val="false"/>
-          <w:iCs w:val="false"/>
-          <w:color w:val="1C1E21"/>
-          <w:sz w:val="21"/>
-          <w:szCs w:val="21"/>
-        </w:rPr>
-        <w:t xml:space="preserve"> Delegated authority is provably narrower than its source, and withdrawal cascades automatically.</w:t>
-      </w:r>
-    </w:p>
-    <w:p>
-      <w:pPr>
-        <w:pStyle w:val="ListParagraph"/>
-        <w:numPr>
-          <w:ilvl w:val="0"/>
-          <w:numId w:val="3"/>
-        </w:numPr>
-        <w:spacing w:after="90" w:line="276"/>
-      </w:pPr>
-      <w:r>
-        <w:rPr>
-          <w:rFonts w:ascii="Georgia" w:cs="Georgia" w:eastAsia="Georgia" w:hAnsi="Georgia"/>
-          <w:b/>
-          <w:bCs/>
-          <w:i w:val="false"/>
-          <w:iCs w:val="false"/>
-          <w:color w:val="1C1E21"/>
-          <w:sz w:val="21"/>
-          <w:szCs w:val="21"/>
-        </w:rPr>
-        <w:t xml:space="preserve">Decisions cite their source.</w:t>
-      </w:r>
-      <w:r>
-        <w:rPr>
-          <w:rFonts w:ascii="Georgia" w:cs="Georgia" w:eastAsia="Georgia" w:hAnsi="Georgia"/>
-          <w:b w:val="false"/>
-          <w:bCs w:val="false"/>
-          <w:i w:val="false"/>
-          <w:iCs w:val="false"/>
-          <w:color w:val="1C1E21"/>
-          <w:sz w:val="21"/>
-          <w:szCs w:val="21"/>
-        </w:rPr>
-        <w:t xml:space="preserve"> A block can name the exact regulation clause and text version behind it.</w:t>
-      </w:r>
-    </w:p>
-    <w:p>
-      <w:pPr>
-        <w:spacing w:after="150" w:line="276"/>
-      </w:pPr>
-      <w:r>
-        <w:rPr>
-          <w:rFonts w:ascii="Georgia" w:cs="Georgia" w:eastAsia="Georgia" w:hAnsi="Georgia"/>
-          <w:b w:val="false"/>
-          <w:bCs w:val="false"/>
-          <w:i w:val="false"/>
-          <w:iCs w:val="false"/>
-          <w:color w:val="1C1E21"/>
-          <w:sz w:val="21"/>
-          <w:szCs w:val="21"/>
-        </w:rPr>
-        <w:t xml:space="preserve">And one differentiator that is easy to miss: </w:t>
-      </w:r>
-      <w:r>
-        <w:rPr>
-          <w:rFonts w:ascii="Georgia" w:cs="Georgia" w:eastAsia="Georgia" w:hAnsi="Georgia"/>
-          <w:b/>
-          <w:bCs/>
-          <w:i w:val="false"/>
-          <w:iCs w:val="false"/>
-          <w:color w:val="1C1E21"/>
-          <w:sz w:val="21"/>
-          <w:szCs w:val="21"/>
-        </w:rPr>
-        <w:t xml:space="preserve">the boundaries are documented in the product itself.</w:t>
-      </w:r>
-      <w:r>
-        <w:rPr>
-          <w:rFonts w:ascii="Georgia" w:cs="Georgia" w:eastAsia="Georgia" w:hAnsi="Georgia"/>
-          <w:b w:val="false"/>
-          <w:bCs w:val="false"/>
-          <w:i w:val="false"/>
-          <w:iCs w:val="false"/>
-          <w:color w:val="1C1E21"/>
-          <w:sz w:val="21"/>
-          <w:szCs w:val="21"/>
-        </w:rPr>
-        <w:t xml:space="preserve"> The sandbox states that it is not a containment boundary. The development-only setting says so. That is a credibility asset with security teams, who spend most of their evaluation time trying to find out what a vendor left out.</w:t>
-      </w:r>
-    </w:p>
-    <w:p>
-      <w:pPr>
-        <w:pBdr>
-          <w:bottom w:val="single" w:color="D7DAE0" w:sz="4" w:space="1"/>
-        </w:pBdr>
-        <w:spacing w:after="200" w:before="160" w:line="240"/>
-      </w:pPr>
-      <w:r>
-        <w:rPr>
-          <w:sz w:val="2"/>
-          <w:szCs w:val="2"/>
-        </w:rPr>
-        <w:t xml:space="preserve"/>
-      </w:r>
-    </w:p>
-    <w:p>
-      <w:pPr>
-        <w:pStyle w:val="Heading1"/>
-      </w:pPr>
-      <w:r>
-        <w:rPr>
-          <w:rFonts w:ascii="Arial" w:cs="Arial" w:eastAsia="Arial" w:hAnsi="Arial"/>
-          <w:b/>
-          <w:bCs/>
-          <w:i w:val="false"/>
-          <w:iCs w:val="false"/>
-          <w:color w:val="0F1114"/>
-          <w:sz w:val="28"/>
-          <w:szCs w:val="28"/>
-        </w:rPr>
-        <w:t xml:space="preserve">13. Glossary</w:t>
+        <w:t xml:space="preserve">12. Glossary</w:t>
       </w:r>
     </w:p>
     <w:tbl>
@@ -6831,7 +6019,7 @@
           <w:sz w:val="28"/>
           <w:szCs w:val="28"/>
         </w:rPr>
-        <w:t xml:space="preserve">14. Questions That Come Up</w:t>
+        <w:t xml:space="preserve">13. Common Questions</w:t>
       </w:r>
     </w:p>
     <w:p>
@@ -6862,7 +6050,7 @@
           <w:sz w:val="21"/>
           <w:szCs w:val="21"/>
         </w:rPr>
-        <w:t xml:space="preserve"> Only five of the fourteen capabilities run on each request, and the first thing that happens is the cheapest possible rejection. Customers who care about this should be encouraged to measure it in their own environment with their own rules — the honest answer depends on how much policy they write.</w:t>
+        <w:t xml:space="preserve"> Only five of the fourteen capabilities run on each request, and the first thing that happens is the cheapest possible rejection. The honest answer depends on how much policy is written, and is best measured in the environment where it will run.</w:t>
       </w:r>
     </w:p>
     <w:p>
@@ -6880,20 +6068,20 @@
           <w:sz w:val="21"/>
           <w:szCs w:val="21"/>
         </w:rPr>
-        <w:t xml:space="preserve">Do we have to rebuild our MCP server?</w:t>
-      </w:r>
-      <w:r>
-        <w:rPr>
-          <w:rFonts w:ascii="Georgia" w:cs="Georgia" w:eastAsia="Georgia" w:hAnsi="Georgia"/>
-          <w:b w:val="false"/>
-          <w:bCs w:val="false"/>
-          <w:i w:val="false"/>
-          <w:iCs w:val="false"/>
-          <w:color w:val="1C1E21"/>
-          <w:sz w:val="21"/>
-          <w:szCs w:val="21"/>
-        </w:rPr>
-        <w:t xml:space="preserve"> No. SecureMCP attaches to an existing server. That is a core design commitment, not a convenience.</w:t>
+        <w:t xml:space="preserve">Does the existing MCP server have to be rebuilt?</w:t>
+      </w:r>
+      <w:r>
+        <w:rPr>
+          <w:rFonts w:ascii="Georgia" w:cs="Georgia" w:eastAsia="Georgia" w:hAnsi="Georgia"/>
+          <w:b w:val="false"/>
+          <w:bCs w:val="false"/>
+          <w:i w:val="false"/>
+          <w:iCs w:val="false"/>
+          <w:color w:val="1C1E21"/>
+          <w:sz w:val="21"/>
+          <w:szCs w:val="21"/>
+        </w:rPr>
+        <w:t xml:space="preserve"> No. SecureMCP attaches to a server that already exists. That is a core design commitment, not a convenience.</w:t>
       </w:r>
     </w:p>
     <w:p>
@@ -6911,20 +6099,20 @@
           <w:sz w:val="21"/>
           <w:szCs w:val="21"/>
         </w:rPr>
-        <w:t xml:space="preserve">What if the governance layer itself fails?</w:t>
-      </w:r>
-      <w:r>
-        <w:rPr>
-          <w:rFonts w:ascii="Georgia" w:cs="Georgia" w:eastAsia="Georgia" w:hAnsi="Georgia"/>
-          <w:b w:val="false"/>
-          <w:bCs w:val="false"/>
-          <w:i w:val="false"/>
-          <w:iCs w:val="false"/>
-          <w:color w:val="1C1E21"/>
-          <w:sz w:val="21"/>
-          <w:szCs w:val="21"/>
-        </w:rPr>
-        <w:t xml:space="preserve"> The rule engine denies rather than allowing. Availability is affected before enforcement is. For a governance product this is the correct trade, and it is worth saying out loud, because it is the opposite of how most software fails.</w:t>
+        <w:t xml:space="preserve">What happens if the governance layer itself fails?</w:t>
+      </w:r>
+      <w:r>
+        <w:rPr>
+          <w:rFonts w:ascii="Georgia" w:cs="Georgia" w:eastAsia="Georgia" w:hAnsi="Georgia"/>
+          <w:b w:val="false"/>
+          <w:bCs w:val="false"/>
+          <w:i w:val="false"/>
+          <w:iCs w:val="false"/>
+          <w:color w:val="1C1E21"/>
+          <w:sz w:val="21"/>
+          <w:szCs w:val="21"/>
+        </w:rPr>
+        <w:t xml:space="preserve"> The rule engine denies rather than allowing. Availability is affected before enforcement is. For a governance system this is the correct trade, and it is the opposite of how most software fails.</w:t>
       </w:r>
     </w:p>
     <w:p>
@@ -6942,7 +6130,7 @@
           <w:sz w:val="21"/>
           <w:szCs w:val="21"/>
         </w:rPr>
-        <w:t xml:space="preserve">Can we use just one piece?</w:t>
+        <w:t xml:space="preserve">Can a single capability be used on its own?</w:t>
       </w:r>
       <w:r>
         <w:rPr>
@@ -6986,7 +6174,7 @@
           <w:sz w:val="21"/>
           <w:szCs w:val="21"/>
         </w:rPr>
-        <w:t xml:space="preserve"> Those govern network calls and user sessions. SecureMCP governs agent actions with awareness of what the action means — that this particular tool touches health records, in production, at high risk. It also adds things a gateway does not: verifiable proof, behaviour monitoring per agent, tool certification, and consent that cannot expand as it is delegated.</w:t>
+        <w:t xml:space="preserve"> Those govern network calls and user sessions. SecureMCP governs agent actions with awareness of what the action means — that this particular tool touches health records, in production, at high risk. It also adds what a gateway does not: verifiable proof, behaviour monitoring for each agent, tool certification, and consent that cannot expand as it is delegated.</w:t>
       </w:r>
     </w:p>
     <w:p>
@@ -7004,7 +6192,7 @@
           <w:sz w:val="21"/>
           <w:szCs w:val="21"/>
         </w:rPr>
-        <w:t xml:space="preserve">Does it work with our existing monitoring?</w:t>
+        <w:t xml:space="preserve">Does it work with existing monitoring?</w:t>
       </w:r>
       <w:r>
         <w:rPr>
@@ -7048,7 +6236,7 @@
           <w:sz w:val="21"/>
           <w:szCs w:val="21"/>
         </w:rPr>
-        <w:t xml:space="preserve"> In the customer's own storage. Options range from in-memory for development to SQLite and PostgreSQL for production. Nothing is sent anywhere by default.</w:t>
+        <w:t xml:space="preserve"> In the organisation's own storage. Options range from in-memory for development to SQLite and PostgreSQL for production. Nothing is sent anywhere by default.</w:t>
       </w:r>
     </w:p>
     <w:p>
@@ -7066,20 +6254,20 @@
           <w:sz w:val="21"/>
           <w:szCs w:val="21"/>
         </w:rPr>
-        <w:t xml:space="preserve">Is there anything we should not do with it?</w:t>
-      </w:r>
-      <w:r>
-        <w:rPr>
-          <w:rFonts w:ascii="Georgia" w:cs="Georgia" w:eastAsia="Georgia" w:hAnsi="Georgia"/>
-          <w:b w:val="false"/>
-          <w:bCs w:val="false"/>
-          <w:i w:val="false"/>
-          <w:iCs w:val="false"/>
-          <w:color w:val="1C1E21"/>
-          <w:sz w:val="21"/>
-          <w:szCs w:val="21"/>
-        </w:rPr>
-        <w:t xml:space="preserve"> Three things. Do not rely on the sandbox for containment — pair it with real isolation. Do not enable the development-only signing bypass in production. Do not sell agreements as the primary control, since the rule engine is the layer that fails closed.</w:t>
+        <w:t xml:space="preserve">Is there anything it should not be relied on for?</w:t>
+      </w:r>
+      <w:r>
+        <w:rPr>
+          <w:rFonts w:ascii="Georgia" w:cs="Georgia" w:eastAsia="Georgia" w:hAnsi="Georgia"/>
+          <w:b w:val="false"/>
+          <w:bCs w:val="false"/>
+          <w:i w:val="false"/>
+          <w:iCs w:val="false"/>
+          <w:color w:val="1C1E21"/>
+          <w:sz w:val="21"/>
+          <w:szCs w:val="21"/>
+        </w:rPr>
+        <w:t xml:space="preserve"> Three things. The sandbox is not containment — pair it with real isolation. The development-only signing bypass must not be enabled in production. And agreements should not serve as the primary control, since the rule engine is the layer that fails closed.</w:t>
       </w:r>
     </w:p>
     <w:p>
@@ -7112,7 +6300,7 @@
           <w:sz w:val="28"/>
           <w:szCs w:val="28"/>
         </w:rPr>
-        <w:t xml:space="preserve">15. The Short Version</w:t>
+        <w:t xml:space="preserve">14. Summary</w:t>
       </w:r>
     </w:p>
     <w:p>
@@ -7148,25 +6336,25 @@
           <w:sz w:val="21"/>
           <w:szCs w:val="21"/>
         </w:rPr>
-        <w:t xml:space="preserve">SecureMCP adds the governance: rules that decide what is allowed and fail closed when uncertain, a record that an outside party can verify without trusting the system that produced it, permissions that shrink rather than grow as they are shared, trust that must be earned through verifiable signatures, and automatic response when an agent's behaviour changes shape.</w:t>
-      </w:r>
-    </w:p>
-    <w:p>
-      <w:pPr>
-        <w:spacing w:after="150" w:line="276"/>
-      </w:pPr>
-      <w:r>
-        <w:rPr>
-          <w:rFonts w:ascii="Georgia" w:cs="Georgia" w:eastAsia="Georgia" w:hAnsi="Georgia"/>
-          <w:b w:val="false"/>
-          <w:bCs w:val="false"/>
-          <w:i w:val="false"/>
-          <w:iCs w:val="false"/>
-          <w:color w:val="1C1E21"/>
-          <w:sz w:val="21"/>
-          <w:szCs w:val="21"/>
-        </w:rPr>
-        <w:t xml:space="preserve">It attaches to what already exists, it turns on one capability at a time, and it documents exactly where its guarantees stop — which is what makes the guarantees it does make worth relying on.</w:t>
+        <w:t xml:space="preserve">SecureMCP adds that governance: rules that decide what is allowed and deny when uncertain, a record an outside party can verify without trusting the system that produced it, permissions that shrink rather than grow as they are shared, trust that must be earned through verifiable signatures, and automatic response when an agent's behaviour changes shape.</w:t>
+      </w:r>
+    </w:p>
+    <w:p>
+      <w:pPr>
+        <w:spacing w:after="150" w:line="276"/>
+      </w:pPr>
+      <w:r>
+        <w:rPr>
+          <w:rFonts w:ascii="Georgia" w:cs="Georgia" w:eastAsia="Georgia" w:hAnsi="Georgia"/>
+          <w:b w:val="false"/>
+          <w:bCs w:val="false"/>
+          <w:i w:val="false"/>
+          <w:iCs w:val="false"/>
+          <w:color w:val="1C1E21"/>
+          <w:sz w:val="21"/>
+          <w:szCs w:val="21"/>
+        </w:rPr>
+        <w:t xml:space="preserve">It attaches to what already exists, it turns on one capability at a time, and it states exactly where its guarantees stop — which is what makes the guarantees it does make worth relying on.</w:t>
       </w:r>
     </w:p>
     <w:sectPr>
@@ -7432,12 +6620,6 @@
   </w:num>
   <w:num w:numId="2">
     <w:abstractNumId w:val="2"/>
-    <w:lvlOverride w:ilvl="0">
-      <w:startOverride w:val="1"/>
-    </w:lvlOverride>
-  </w:num>
-  <w:num w:numId="3">
-    <w:abstractNumId w:val="3"/>
     <w:lvlOverride w:ilvl="0">
       <w:startOverride w:val="1"/>
     </w:lvlOverride>

</xml_diff>